<commit_message>
Finalize Japanese research summary and A0 conference poster, add overview figures and build scripts, update 3D demo and progress docs
- Add 研究概要書 variants (JIANGXIJIE_MA26006) and 学会ポスター A0 variants with build/revision scripts
- Add analysis scripts (DEAP three-way, overview figure) and regenerated overview figures
- Update dreamer-vad-3d demo (app.js, styles, i18n) and progress docs
- gitignore AI scratch working directories and inspect dumps
</commit_message>
<xml_diff>
--- a/paper/DREAMER_NRC_研究概要書_2頁版.docx
+++ b/paper/DREAMER_NRC_研究概要書_2頁版.docx
@@ -5,66 +5,87 @@
     <w:p>
       <w:pPr>
         <w:keepNext/>
-        <w:spacing w:before="0" w:after="40" w:line="240" w:lineRule="auto"/>
+        <w:spacing w:after="40" w:line="240" w:lineRule="auto"/>
         <w:jc w:val="center"/>
       </w:pPr>
       <w:r>
         <w:rPr>
-          <w:rFonts w:ascii="Times New Roman" w:hAnsi="Times New Roman" w:cs="Times New Roman" w:eastAsia="ＭＳ ゴシック"/>
+          <w:rFonts w:eastAsia="ＭＳ ゴシック"/>
           <w:b/>
           <w:sz w:val="28"/>
         </w:rPr>
         <w:t>感情語に対する意味的評価と映像によって喚起された</w:t>
+      </w:r>
+      <w:r>
+        <w:rPr>
+          <w:rFonts w:eastAsia="ＭＳ ゴシック"/>
+          <w:b/>
+          <w:sz w:val="28"/>
+        </w:rPr>
         <w:br/>
-        <w:t>情動体験とのVAD次元別対応関係の検討</w:t>
-      </w:r>
-    </w:p>
-    <w:p>
-      <w:pPr>
-        <w:spacing w:after="0"/>
-        <w:jc w:val="center"/>
-      </w:pPr>
-      <w:r>
-        <w:rPr>
-          <w:rFonts w:ascii="Times New Roman" w:hAnsi="Times New Roman" w:cs="Times New Roman" w:eastAsia="ＭＳ 明朝"/>
-          <w:sz w:val="20"/>
-        </w:rPr>
-        <w:t>基盤システムソフトウェア研究室</w:t>
+      </w:r>
+      <w:r>
+        <w:rPr>
+          <w:rFonts w:eastAsia="ＭＳ ゴシック"/>
+          <w:b/>
+          <w:sz w:val="28"/>
+        </w:rPr>
+        <w:t>情動体験との</w:t>
+      </w:r>
+      <w:r>
+        <w:rPr>
+          <w:rFonts w:eastAsia="ＭＳ ゴシック"/>
+          <w:b/>
+          <w:sz w:val="28"/>
+        </w:rPr>
+        <w:t>VAD</w:t>
+      </w:r>
+      <w:r>
+        <w:rPr>
+          <w:rFonts w:eastAsia="ＭＳ ゴシック"/>
+          <w:b/>
+          <w:sz w:val="28"/>
+        </w:rPr>
+        <w:t>次元別対応関係の検討</w:t>
       </w:r>
     </w:p>
     <w:p>
       <w:pPr>
         <w:spacing w:after="20"/>
-        <w:jc w:val="center"/>
-      </w:pPr>
-      <w:r>
-        <w:rPr>
-          <w:rFonts w:ascii="Times New Roman" w:hAnsi="Times New Roman" w:cs="Times New Roman" w:eastAsia="ＭＳ 明朝"/>
-          <w:sz w:val="20"/>
-        </w:rPr>
-        <w:t>指導教員　菅谷みどり　　発表者　MA26006　姜晰頡</w:t>
-      </w:r>
-    </w:p>
-    <w:p>
-      <w:pPr>
-        <w:spacing w:after="40"/>
-      </w:pPr>
-      <w:r>
-        <w:rPr>
-          <w:rFonts w:ascii="Times New Roman" w:hAnsi="Times New Roman" w:cs="Times New Roman" w:eastAsia="ＭＳ 明朝"/>
-          <w:sz w:val="18"/>
-        </w:rPr>
-        <w:t>目次　1 背景・課題……1　2 目的……1　3 方法……1　4 結果……1-2　5 考察……2　6 研究の意義……2　7 制約……2　8 まとめと今後の課題……2</w:t>
+      </w:pPr>
+      <w:r>
+        <w:t xml:space="preserve">指導教員　菅谷みどり　　</w:t>
+      </w:r>
+      <w:r>
+        <w:rPr>
+          <w:rFonts w:hint="eastAsia"/>
+        </w:rPr>
+        <w:t xml:space="preserve">                                                                                   </w:t>
+      </w:r>
+      <w:r>
+        <w:t xml:space="preserve">　</w:t>
+      </w:r>
+      <w:r>
+        <w:rPr>
+          <w:rFonts w:hint="eastAsia"/>
+        </w:rPr>
+        <w:t xml:space="preserve">        </w:t>
+      </w:r>
+      <w:r>
+        <w:t>MA26006</w:t>
+      </w:r>
+      <w:r>
+        <w:t xml:space="preserve">　姜晰頡</w:t>
       </w:r>
     </w:p>
     <w:p>
       <w:pPr>
         <w:sectPr>
-          <w:footerReference w:type="default" r:id="rId17"/>
+          <w:footerReference w:type="default" r:id="rId7"/>
           <w:type w:val="continuous"/>
           <w:pgSz w:w="11906" w:h="16838"/>
           <w:pgMar w:top="1138" w:right="1310" w:bottom="1138" w:left="1310" w:header="283" w:footer="283" w:gutter="0"/>
-          <w:cols w:num="1" w:space="360" w:equalWidth="1"/>
+          <w:cols w:space="360"/>
         </w:sectPr>
       </w:pPr>
     </w:p>
@@ -75,56 +96,108 @@
       </w:pPr>
       <w:r>
         <w:rPr>
-          <w:rFonts w:ascii="Times New Roman" w:hAnsi="Times New Roman" w:cs="Times New Roman" w:eastAsia="ＭＳ ゴシック"/>
+          <w:rFonts w:eastAsia="ＭＳ ゴシック"/>
           <w:b/>
-          <w:sz w:val="20"/>
-        </w:rPr>
-        <w:t>1 背景・課題</w:t>
-      </w:r>
-    </w:p>
-    <w:p>
-      <w:pPr>
-        <w:keepLines w:val="0"/>
+        </w:rPr>
+        <w:t xml:space="preserve">1 </w:t>
+      </w:r>
+      <w:r>
+        <w:rPr>
+          <w:rFonts w:eastAsia="ＭＳ ゴシック"/>
+          <w:b/>
+        </w:rPr>
+        <w:t>背景・研究課題</w:t>
+      </w:r>
+    </w:p>
+    <w:p>
+      <w:pPr>
         <w:widowControl/>
-        <w:spacing w:before="0" w:after="0" w:line="252" w:lineRule="auto"/>
         <w:ind w:firstLine="200"/>
       </w:pPr>
       <w:r>
-        <w:rPr>
-          <w:rFonts w:ascii="Times New Roman" w:hAnsi="Times New Roman" w:cs="Times New Roman" w:eastAsia="ＭＳ 明朝"/>
-          <w:sz w:val="20"/>
-        </w:rPr>
-        <w:t>感情研究では，Valence（快・不快），Arousal（覚醒度），Dominance（支配感）からなるVAD座標が，感情語辞書，映像刺激データベース，感情認識モデルの共通表現として利用されている．しかし，NRC-VADが測定する語の一般的な感情属性と，映像視聴後に報告される即時的体験は，同名の尺度であっても測定対象が異なる[1-4]．両者を検証せずに統合すると，課題，尺度，標本の差を感情差として解釈する危険がある．</w:t>
-      </w:r>
-    </w:p>
-    <w:p>
-      <w:pPr>
-        <w:keepLines w:val="0"/>
+        <w:t>感情は，感情価（</w:t>
+      </w:r>
+      <w:r>
+        <w:t>Valence</w:t>
+      </w:r>
+      <w:r>
+        <w:t>），覚醒度（</w:t>
+      </w:r>
+      <w:r>
+        <w:t>Arousal</w:t>
+      </w:r>
+      <w:r>
+        <w:t>），支配性（</w:t>
+      </w:r>
+      <w:r>
+        <w:t>Dominance</w:t>
+      </w:r>
+      <w:r>
+        <w:t>）の</w:t>
+      </w:r>
+      <w:r>
+        <w:t>3</w:t>
+      </w:r>
+      <w:r>
+        <w:t>次元で表せる．この表現を</w:t>
+      </w:r>
+      <w:r>
+        <w:t>VAD</w:t>
+      </w:r>
+      <w:r>
+        <w:t>という．感情価は快・不快を表す．覚醒度は心の活性度を表す．支配性は状況を制御している感覚を表す</w:t>
+      </w:r>
+      <w:r>
+        <w:t>[1]</w:t>
+      </w:r>
+      <w:r>
+        <w:t>．</w:t>
+      </w:r>
+    </w:p>
+    <w:p>
+      <w:pPr>
         <w:widowControl/>
-        <w:spacing w:before="0" w:after="0" w:line="252" w:lineRule="auto"/>
         <w:ind w:firstLine="200"/>
       </w:pPr>
       <w:r>
-        <w:rPr>
-          <w:rFonts w:ascii="Times New Roman" w:hAnsi="Times New Roman" w:cs="Times New Roman" w:eastAsia="ＭＳ 明朝"/>
-          <w:sz w:val="20"/>
-        </w:rPr>
-        <w:t>そこで本研究は，語彙規範から誘発体験へのVADの転用可能性を，単なる相関ではなく，構造対応，全体的な尺度変換，感情固有の残差に分解して検証する．</w:t>
-      </w:r>
-    </w:p>
-    <w:p>
-      <w:pPr>
-        <w:keepLines w:val="0"/>
+        <w:t>VAD</w:t>
+      </w:r>
+      <w:r>
+        <w:t>は，感情語が一般に持つ意味の評価に用いられる．また，映像によって喚起された情動体験の評価にも用いられる．しかし，両者は評価対象が異なる．前者は語の一般的な意味を測る．後者は特定の映像を見た後の体験を測る</w:t>
+      </w:r>
+      <w:r>
+        <w:t>[5</w:t>
+      </w:r>
+      <w:r>
+        <w:t>，</w:t>
+      </w:r>
+      <w:r>
+        <w:t>6]</w:t>
+      </w:r>
+      <w:r>
+        <w:t>．そのため，同じ</w:t>
+      </w:r>
+      <w:r>
+        <w:t>VAD</w:t>
+      </w:r>
+      <w:r>
+        <w:t>を用いても，両者の値が対応するとは限らない．以下，前者を「意味的評価」，後者を「情動体験評価」と呼ぶ．</w:t>
+      </w:r>
+    </w:p>
+    <w:p>
+      <w:pPr>
+        <w:keepLines/>
         <w:widowControl/>
-        <w:spacing w:before="0" w:after="0" w:line="252" w:lineRule="auto"/>
         <w:ind w:firstLine="200"/>
       </w:pPr>
       <w:r>
-        <w:rPr>
-          <w:rFonts w:ascii="Times New Roman" w:hAnsi="Times New Roman" w:cs="Times New Roman" w:eastAsia="ＭＳ 明朝"/>
-          <w:sz w:val="20"/>
-        </w:rPr>
-        <w:t>体験評定には当該場面の情報だけでなく，感情語に関する意味知識も混在すると考えられる[4，5]．したがって両者には一定の対応が予測される一方，刺激文脈や想起可能な情報の差によって完全な一致は期待できない．本研究はこの「関連するが等価ではない」という境界を定量化する．</w:t>
+        <w:t>そこで本研究では，次の問いを設定した．意味的評価と情動体験評価は，</w:t>
+      </w:r>
+      <w:r>
+        <w:t>VAD</w:t>
+      </w:r>
+      <w:r>
+        <w:t>各次元でどの程度対応するか．また，両者はどのような差異を示すか．</w:t>
       </w:r>
     </w:p>
     <w:p>
@@ -134,26 +207,59 @@
       </w:pPr>
       <w:r>
         <w:rPr>
-          <w:rFonts w:ascii="Times New Roman" w:hAnsi="Times New Roman" w:cs="Times New Roman" w:eastAsia="ＭＳ ゴシック"/>
+          <w:rFonts w:eastAsia="ＭＳ ゴシック"/>
           <w:b/>
-          <w:sz w:val="20"/>
-        </w:rPr>
-        <w:t>2 目的</w:t>
-      </w:r>
-    </w:p>
-    <w:p>
-      <w:pPr>
-        <w:keepLines w:val="0"/>
+        </w:rPr>
+        <w:t xml:space="preserve">2 </w:t>
+      </w:r>
+      <w:r>
+        <w:rPr>
+          <w:rFonts w:eastAsia="ＭＳ ゴシック"/>
+          <w:b/>
+        </w:rPr>
+        <w:t>目的</w:t>
+      </w:r>
+    </w:p>
+    <w:p>
+      <w:pPr>
         <w:widowControl/>
-        <w:spacing w:before="0" w:after="0" w:line="252" w:lineRule="auto"/>
         <w:ind w:firstLine="200"/>
       </w:pPr>
       <w:r>
-        <w:rPr>
-          <w:rFonts w:ascii="Times New Roman" w:hAnsi="Times New Roman" w:cs="Times New Roman" w:eastAsia="ＭＳ 明朝"/>
-          <w:sz w:val="20"/>
-        </w:rPr>
-        <w:t>NRC-VAD v2.1とDREAMERに共通する9感情について，（1）V，A，D各次元のカテゴリー構造が対応するか，（2）誘発評定に全体的な圧縮または平行移動が存在するか，（3）全体変換を除いても残る感情固有の乖離は何かを明らかにする．さらに，EEG及びECG特徴量が個人レベルのVAD乖離を説明するかを探索する．</w:t>
+        <w:t>NRC-VAD</w:t>
+      </w:r>
+      <w:r>
+        <w:t>と</w:t>
+      </w:r>
+      <w:r>
+        <w:t>DREAMER</w:t>
+      </w:r>
+      <w:r>
+        <w:t>に共通する</w:t>
+      </w:r>
+      <w:r>
+        <w:t>9</w:t>
+      </w:r>
+      <w:r>
+        <w:t>感情を比較する．まず，感情カテゴリーの並び方が保たれるかを調べる．本研究では，この並び方を「相対構造」と呼ぶ．次に，値の広がりに差があるかを調べる．この差を「尺度差」と呼ぶ．以上から，対応と差異を</w:t>
+      </w:r>
+      <w:r>
+        <w:t>V</w:t>
+      </w:r>
+      <w:r>
+        <w:t>・</w:t>
+      </w:r>
+      <w:r>
+        <w:t>A</w:t>
+      </w:r>
+      <w:r>
+        <w:t>・</w:t>
+      </w:r>
+      <w:r>
+        <w:t>D</w:t>
+      </w:r>
+      <w:r>
+        <w:t>ごとに整理する．</w:t>
       </w:r>
     </w:p>
     <w:p>
@@ -163,41 +269,236 @@
       </w:pPr>
       <w:r>
         <w:rPr>
-          <w:rFonts w:ascii="Times New Roman" w:hAnsi="Times New Roman" w:cs="Times New Roman" w:eastAsia="ＭＳ ゴシック"/>
+          <w:rFonts w:eastAsia="ＭＳ ゴシック"/>
           <w:b/>
-          <w:sz w:val="20"/>
-        </w:rPr>
-        <w:t>3 方法</w:t>
-      </w:r>
-    </w:p>
-    <w:p>
-      <w:pPr>
-        <w:keepLines w:val="0"/>
+        </w:rPr>
+        <w:t xml:space="preserve">3 </w:t>
+      </w:r>
+      <w:r>
+        <w:rPr>
+          <w:rFonts w:eastAsia="ＭＳ ゴシック"/>
+          <w:b/>
+        </w:rPr>
+        <w:t>対象データと分析</w:t>
+      </w:r>
+    </w:p>
+    <w:p>
+      <w:pPr>
         <w:widowControl/>
-        <w:spacing w:before="0" w:after="0" w:line="252" w:lineRule="auto"/>
         <w:ind w:firstLine="200"/>
       </w:pPr>
       <w:r>
-        <w:rPr>
-          <w:rFonts w:ascii="Times New Roman" w:hAnsi="Times New Roman" w:cs="Times New Roman" w:eastAsia="ＭＳ 明朝"/>
-          <w:sz w:val="20"/>
-        </w:rPr>
-        <w:t>DREAMERの23名，18映像，414試行から，9感情各2映像のVAD評定を抽出した[2]．NRC-VADの同名英語名詞を主分析とし[3]，両尺度を[-1，1]へ線形変換した．推測単位は414試行ではなく9感情カテゴリーである．Pearson及びSpearman相関，9! = 362,880通りの正確置換検定，参加者と映像を再抽出する5,000回の階層bootstrapを実施した．さらに，次元別アフィン写像，leave-one-emotion-out（LOEO）校正，感情を1つずつ除外する影響分析，語形及びD反転の感度分析を行った．</w:t>
-      </w:r>
-    </w:p>
-    <w:p>
-      <w:pPr>
-        <w:keepLines w:val="0"/>
+        <w:t>NRC-VAD</w:t>
+      </w:r>
+      <w:r>
+        <w:t>は，感情語が一般に持つ</w:t>
+      </w:r>
+      <w:r>
+        <w:t>VAD</w:t>
+      </w:r>
+      <w:r>
+        <w:t>の意味を数値化した辞書である</w:t>
+      </w:r>
+      <w:r>
+        <w:t>[3]</w:t>
+      </w:r>
+      <w:r>
+        <w:t>．本研究では，これを意味的評価の参照値とした．</w:t>
+      </w:r>
+      <w:r>
+        <w:t>DREAMER</w:t>
+      </w:r>
+      <w:r>
+        <w:t>には，</w:t>
+      </w:r>
+      <w:r>
+        <w:t>23</w:t>
+      </w:r>
+      <w:r>
+        <w:t>名が</w:t>
+      </w:r>
+      <w:r>
+        <w:t>18</w:t>
+      </w:r>
+      <w:r>
+        <w:t>本の映像を見た後に回答した</w:t>
+      </w:r>
+      <w:r>
+        <w:t>VAD</w:t>
+      </w:r>
+      <w:r>
+        <w:t>評定がある</w:t>
+      </w:r>
+      <w:r>
+        <w:t>[2]</w:t>
+      </w:r>
+      <w:r>
+        <w:t>．全</w:t>
+      </w:r>
+      <w:r>
+        <w:t>414</w:t>
+      </w:r>
+      <w:r>
+        <w:t>試行を</w:t>
+      </w:r>
+      <w:r>
+        <w:t>9</w:t>
+      </w:r>
+      <w:r>
+        <w:t>感情カテゴリーにまとめた．各カテゴリーには</w:t>
+      </w:r>
+      <w:r>
+        <w:t>2</w:t>
+      </w:r>
+      <w:r>
+        <w:t>本の映像が含まれる．</w:t>
+      </w:r>
+    </w:p>
+    <w:p>
+      <w:pPr>
         <w:widowControl/>
-        <w:spacing w:before="0" w:after="0" w:line="252" w:lineRule="auto"/>
         <w:ind w:firstLine="200"/>
       </w:pPr>
       <w:r>
-        <w:rPr>
-          <w:rFonts w:ascii="Times New Roman" w:hAnsi="Times New Roman" w:cs="Times New Roman" w:eastAsia="ＭＳ 明朝"/>
-          <w:sz w:val="20"/>
-        </w:rPr>
-        <w:t>分析は三段階で構成した．第1段階では各軸の相関によりカテゴリーの相対構造を，第2段階では軸を回転させない三次元構成一致度とアフィン写像により全体的な尺度差を，第3段階では他の8感情だけで写像を推定するLOEO残差によりカテゴリー固有の乖離を評価した．これにより，高相関と絶対座標の一致を区別した．</w:t>
+        <w:t>CASE</w:t>
+      </w:r>
+      <w:r>
+        <w:t>には，</w:t>
+      </w:r>
+      <w:r>
+        <w:t>30</w:t>
+      </w:r>
+      <w:r>
+        <w:t>名が</w:t>
+      </w:r>
+      <w:r>
+        <w:t>8</w:t>
+      </w:r>
+      <w:r>
+        <w:t>本の映像を見ている間に回答した</w:t>
+      </w:r>
+      <w:r>
+        <w:t>V</w:t>
+      </w:r>
+      <w:r>
+        <w:t>と</w:t>
+      </w:r>
+      <w:r>
+        <w:t>A</w:t>
+      </w:r>
+      <w:r>
+        <w:t>の連続評定がある</w:t>
+      </w:r>
+      <w:r>
+        <w:t>[4]</w:t>
+      </w:r>
+      <w:r>
+        <w:t>．</w:t>
+      </w:r>
+      <w:r>
+        <w:t>D</w:t>
+      </w:r>
+      <w:r>
+        <w:t>は含まれない．また，共通する感情は</w:t>
+      </w:r>
+      <w:r>
+        <w:t>4</w:t>
+      </w:r>
+      <w:r>
+        <w:t>カテゴリーだけである．そのため，</w:t>
+      </w:r>
+      <w:r>
+        <w:t>CASE</w:t>
+      </w:r>
+      <w:r>
+        <w:t>は分析手順の補足確認にのみ用いた．主な結論は</w:t>
+      </w:r>
+      <w:r>
+        <w:t>DREAMER</w:t>
+      </w:r>
+      <w:r>
+        <w:t>から導いた．</w:t>
+      </w:r>
+    </w:p>
+    <w:p>
+      <w:pPr>
+        <w:widowControl/>
+        <w:ind w:firstLine="200"/>
+      </w:pPr>
+      <w:r>
+        <w:t>各尺度の範囲が異なるため，すべて</w:t>
+      </w:r>
+      <w:r>
+        <w:t>[-1</w:t>
+      </w:r>
+      <w:r>
+        <w:t>，</w:t>
+      </w:r>
+      <w:r>
+        <w:t>1]</w:t>
+      </w:r>
+      <w:r>
+        <w:t>に変換した．相対構造は</w:t>
+      </w:r>
+      <w:r>
+        <w:t>Pearson</w:t>
+      </w:r>
+      <w:r>
+        <w:t>相関で調べた．偶然に得られる対応かどうかは，正確置換検定で確認した．</w:t>
+      </w:r>
+      <w:r>
+        <w:t>V</w:t>
+      </w:r>
+      <w:r>
+        <w:t>・</w:t>
+      </w:r>
+      <w:r>
+        <w:t>A</w:t>
+      </w:r>
+      <w:r>
+        <w:t>・</w:t>
+      </w:r>
+      <w:r>
+        <w:t>D</w:t>
+      </w:r>
+      <w:r>
+        <w:t>の</w:t>
+      </w:r>
+      <w:r>
+        <w:t>3</w:t>
+      </w:r>
+      <w:r>
+        <w:t>検定には</w:t>
+      </w:r>
+      <w:r>
+        <w:t>Holm</w:t>
+      </w:r>
+      <w:r>
+        <w:t>補正を用いた．不確実性は</w:t>
+      </w:r>
+      <w:r>
+        <w:t>5,000</w:t>
+      </w:r>
+      <w:r>
+        <w:t>回の階層</w:t>
+      </w:r>
+      <w:r>
+        <w:t>bootstrap</w:t>
+      </w:r>
+      <w:r>
+        <w:t>で評価した．尺度差は回帰傾きで確認した．傾き</w:t>
+      </w:r>
+      <w:r>
+        <w:t>1</w:t>
+      </w:r>
+      <w:r>
+        <w:t>は同じ広がりを表す．</w:t>
+      </w:r>
+      <w:r>
+        <w:t>1</w:t>
+      </w:r>
+      <w:r>
+        <w:t>より小さい傾きは，値が中立点方向に縮むことを表す．</w:t>
       </w:r>
     </w:p>
     <w:p>
@@ -207,26 +508,53 @@
       </w:pPr>
       <w:r>
         <w:rPr>
-          <w:rFonts w:ascii="Times New Roman" w:hAnsi="Times New Roman" w:cs="Times New Roman" w:eastAsia="ＭＳ ゴシック"/>
+          <w:rFonts w:eastAsia="ＭＳ ゴシック"/>
           <w:b/>
-          <w:sz w:val="20"/>
-        </w:rPr>
-        <w:t>4 結果</w:t>
-      </w:r>
-    </w:p>
-    <w:p>
-      <w:pPr>
-        <w:keepLines w:val="0"/>
+        </w:rPr>
+        <w:t xml:space="preserve">4 </w:t>
+      </w:r>
+      <w:r>
+        <w:rPr>
+          <w:rFonts w:eastAsia="ＭＳ ゴシック"/>
+          <w:b/>
+        </w:rPr>
+        <w:t>結果</w:t>
+      </w:r>
+    </w:p>
+    <w:p>
+      <w:pPr>
         <w:widowControl/>
-        <w:spacing w:before="0" w:after="0" w:line="252" w:lineRule="auto"/>
         <w:ind w:firstLine="200"/>
       </w:pPr>
       <w:r>
-        <w:rPr>
-          <w:rFonts w:ascii="Times New Roman" w:hAnsi="Times New Roman" w:cs="Times New Roman" w:eastAsia="ＭＳ 明朝"/>
-          <w:sz w:val="20"/>
-        </w:rPr>
-        <w:t>Valenceは強く安定した対応を示し，Arousalは線形対応を示したが順位対応は不安定であった．Dominanceには対応が認められなかった．VAD軸を回転させない全体構成一致度はC = .529，正確p = .0058，95% CI [.299，.651]であった．</w:t>
+        <w:t>Valence</w:t>
+      </w:r>
+      <w:r>
+        <w:t>では強い正の対応が得られた．</w:t>
+      </w:r>
+      <w:r>
+        <w:t>Arousal</w:t>
+      </w:r>
+      <w:r>
+        <w:t>でも正の対応が得られた．ただし，感情カテゴリーの順位は安定しなかった．</w:t>
+      </w:r>
+      <w:r>
+        <w:t>Dominance</w:t>
+      </w:r>
+      <w:r>
+        <w:t>では対応が得られなかった（表</w:t>
+      </w:r>
+      <w:r>
+        <w:t>1</w:t>
+      </w:r>
+      <w:r>
+        <w:t>）．この結果から，対応の形は</w:t>
+      </w:r>
+      <w:r>
+        <w:t>VAD</w:t>
+      </w:r>
+      <w:r>
+        <w:t>の次元によって異なると考えた．</w:t>
       </w:r>
     </w:p>
     <w:p>
@@ -235,33 +563,37 @@
           <w:type w:val="continuous"/>
           <w:pgSz w:w="11906" w:h="16838"/>
           <w:pgMar w:top="1138" w:right="1310" w:bottom="1138" w:left="1310" w:header="283" w:footer="283" w:gutter="0"/>
-          <w:cols w:num="2" w:space="360" w:equalWidth="1"/>
+          <w:cols w:num="2" w:space="360"/>
         </w:sectPr>
       </w:pPr>
     </w:p>
     <w:p>
       <w:pPr>
         <w:keepNext/>
-        <w:spacing w:before="20" w:after="0"/>
+        <w:spacing w:before="20"/>
         <w:jc w:val="center"/>
       </w:pPr>
       <w:r>
+        <w:rPr>
+          <w:noProof/>
+        </w:rPr>
         <w:drawing>
-          <wp:inline xmlns:a="http://schemas.openxmlformats.org/drawingml/2006/main" xmlns:pic="http://schemas.openxmlformats.org/drawingml/2006/picture">
-            <wp:extent cx="5577840" cy="2037795"/>
-            <wp:docPr id="1" name="Picture 1"/>
+          <wp:inline distT="0" distB="0" distL="0" distR="0">
+            <wp:extent cx="5669280" cy="1975688"/>
+            <wp:effectExtent l="0" t="0" r="0" b="0"/>
+            <wp:docPr id="1" name="Picture 1" descr="意味的評価と情動体験評価に共通する9感情について，Valence，Arousal，Dominanceの次元別散布図を示す．" title="意味的評価と情動体験評価の次元別対応"/>
             <wp:cNvGraphicFramePr>
-              <a:graphicFrameLocks noChangeAspect="1"/>
+              <a:graphicFrameLocks xmlns:a="http://schemas.openxmlformats.org/drawingml/2006/main" noChangeAspect="1"/>
             </wp:cNvGraphicFramePr>
-            <a:graphic>
+            <a:graphic xmlns:a="http://schemas.openxmlformats.org/drawingml/2006/main">
               <a:graphicData uri="http://schemas.openxmlformats.org/drawingml/2006/picture">
-                <pic:pic>
+                <pic:pic xmlns:pic="http://schemas.openxmlformats.org/drawingml/2006/picture">
                   <pic:nvPicPr>
-                    <pic:cNvPr id="0" name="figure_1_dimension_alignment.png"/>
+                    <pic:cNvPr id="0" name="figure_overview_main.png"/>
                     <pic:cNvPicPr/>
                   </pic:nvPicPr>
                   <pic:blipFill>
-                    <a:blip r:embed="rId18"/>
+                    <a:blip r:embed="rId8"/>
                     <a:stretch>
                       <a:fillRect/>
                     </a:stretch>
@@ -269,9 +601,11 @@
                   <pic:spPr>
                     <a:xfrm>
                       <a:off x="0" y="0"/>
-                      <a:ext cx="5577840" cy="2037795"/>
+                      <a:ext cx="5669280" cy="1975688"/>
                     </a:xfrm>
-                    <a:prstGeom prst="rect"/>
+                    <a:prstGeom prst="rect">
+                      <a:avLst/>
+                    </a:prstGeom>
                   </pic:spPr>
                 </pic:pic>
               </a:graphicData>
@@ -282,15 +616,25 @@
     </w:p>
     <w:p>
       <w:pPr>
-        <w:spacing w:before="0" w:after="0"/>
         <w:jc w:val="center"/>
       </w:pPr>
       <w:r>
         <w:rPr>
-          <w:rFonts w:ascii="Times New Roman" w:hAnsi="Times New Roman" w:cs="Times New Roman" w:eastAsia="ＭＳ ゴシック"/>
-          <w:sz w:val="20"/>
-        </w:rPr>
-        <w:t>図1 次元別のNRC語彙規範とDREAMER誘発評定の対応</w:t>
+          <w:rFonts w:eastAsia="ＭＳ ゴシック"/>
+        </w:rPr>
+        <w:t>図</w:t>
+      </w:r>
+      <w:r>
+        <w:rPr>
+          <w:rFonts w:eastAsia="ＭＳ ゴシック"/>
+        </w:rPr>
+        <w:t xml:space="preserve">1 </w:t>
+      </w:r>
+      <w:r>
+        <w:rPr>
+          <w:rFonts w:eastAsia="ＭＳ ゴシック"/>
+        </w:rPr>
+        <w:t>意味的評価と情動体験評価の次元別対応</w:t>
       </w:r>
     </w:p>
     <w:p>
@@ -299,59 +643,99 @@
           <w:type w:val="continuous"/>
           <w:pgSz w:w="11906" w:h="16838"/>
           <w:pgMar w:top="1138" w:right="1310" w:bottom="1138" w:left="1310" w:header="283" w:footer="283" w:gutter="0"/>
-          <w:cols w:num="1" w:space="360" w:equalWidth="1"/>
+          <w:cols w:space="360"/>
         </w:sectPr>
       </w:pPr>
     </w:p>
     <w:p>
       <w:pPr>
         <w:keepNext/>
-        <w:spacing w:before="0" w:after="20"/>
+        <w:spacing w:after="20"/>
         <w:jc w:val="center"/>
       </w:pPr>
       <w:r>
         <w:rPr>
-          <w:rFonts w:ascii="Times New Roman" w:hAnsi="Times New Roman" w:cs="Times New Roman" w:eastAsia="ＭＳ ゴシック"/>
-          <w:sz w:val="20"/>
-        </w:rPr>
-        <w:t>表1 次元別の文脈横断的対応</w:t>
+          <w:rFonts w:eastAsia="ＭＳ ゴシック"/>
+        </w:rPr>
+        <w:lastRenderedPageBreak/>
+        <w:t>表</w:t>
+      </w:r>
+      <w:r>
+        <w:rPr>
+          <w:rFonts w:eastAsia="ＭＳ ゴシック"/>
+        </w:rPr>
+        <w:t>1 NRC-VAD</w:t>
+      </w:r>
+      <w:r>
+        <w:rPr>
+          <w:rFonts w:eastAsia="ＭＳ ゴシック"/>
+        </w:rPr>
+        <w:t>と</w:t>
+      </w:r>
+      <w:r>
+        <w:rPr>
+          <w:rFonts w:eastAsia="ＭＳ ゴシック"/>
+        </w:rPr>
+        <w:t>DREAMER</w:t>
+      </w:r>
+      <w:r>
+        <w:rPr>
+          <w:rFonts w:eastAsia="ＭＳ ゴシック"/>
+        </w:rPr>
+        <w:t>の次元別対応（</w:t>
+      </w:r>
+      <w:r>
+        <w:rPr>
+          <w:rFonts w:eastAsia="ＭＳ ゴシック"/>
+        </w:rPr>
+        <w:t>9</w:t>
+      </w:r>
+      <w:r>
+        <w:rPr>
+          <w:rFonts w:eastAsia="ＭＳ ゴシック"/>
+        </w:rPr>
+        <w:t>感情カテゴリー）</w:t>
       </w:r>
     </w:p>
     <w:tbl>
       <w:tblPr>
-        <w:tblW w:type="auto" w:w="0"/>
+        <w:tblW w:w="8600" w:type="dxa"/>
         <w:jc w:val="center"/>
         <w:tblLayout w:type="fixed"/>
-        <w:tblLook w:firstColumn="1" w:firstRow="1" w:lastColumn="0" w:lastRow="0" w:noHBand="0" w:noVBand="1" w:val="04A0"/>
+        <w:tblLook w:val="04A0" w:firstRow="1" w:lastRow="0" w:firstColumn="1" w:lastColumn="0" w:noHBand="0" w:noVBand="1"/>
       </w:tblPr>
       <w:tblGrid>
-        <w:gridCol w:w="1857"/>
-        <w:gridCol w:w="1857"/>
-        <w:gridCol w:w="1857"/>
-        <w:gridCol w:w="1857"/>
-        <w:gridCol w:w="1857"/>
+        <w:gridCol w:w="1200"/>
+        <w:gridCol w:w="1350"/>
+        <w:gridCol w:w="1350"/>
+        <w:gridCol w:w="2350"/>
+        <w:gridCol w:w="2350"/>
       </w:tblGrid>
       <w:tr>
+        <w:trPr>
+          <w:tblHeader/>
+          <w:jc w:val="center"/>
+        </w:trPr>
         <w:tc>
           <w:tcPr>
-            <w:tcW w:type="dxa" w:w="1150"/>
+            <w:tcW w:w="1200" w:type="dxa"/>
+            <w:shd w:val="clear" w:color="auto" w:fill="D9E2F3"/>
             <w:tcMar>
               <w:top w:w="70" w:type="dxa"/>
-              <w:start w:w="90" w:type="dxa"/>
+              <w:left w:w="90" w:type="dxa"/>
               <w:bottom w:w="70" w:type="dxa"/>
-              <w:end w:w="90" w:type="dxa"/>
+              <w:right w:w="90" w:type="dxa"/>
             </w:tcMar>
             <w:vAlign w:val="center"/>
-            <w:shd w:fill="D9E2F3"/>
           </w:tcPr>
           <w:p>
             <w:pPr>
-              <w:spacing w:before="0" w:after="0" w:line="240" w:lineRule="auto"/>
+              <w:spacing w:line="240" w:lineRule="auto"/>
               <w:jc w:val="center"/>
             </w:pPr>
             <w:r>
               <w:rPr>
-                <w:rFonts w:ascii="Times New Roman" w:hAnsi="Times New Roman" w:cs="Times New Roman" w:eastAsia="ＭＳ ゴシック"/>
+                <w:rFonts w:eastAsia="ＭＳ ゴシック"/>
                 <w:b/>
                 <w:sz w:val="18"/>
               </w:rPr>
@@ -361,24 +745,24 @@
         </w:tc>
         <w:tc>
           <w:tcPr>
-            <w:tcW w:type="dxa" w:w="1300"/>
+            <w:tcW w:w="1350" w:type="dxa"/>
+            <w:shd w:val="clear" w:color="auto" w:fill="D9E2F3"/>
             <w:tcMar>
               <w:top w:w="70" w:type="dxa"/>
-              <w:start w:w="90" w:type="dxa"/>
+              <w:left w:w="90" w:type="dxa"/>
               <w:bottom w:w="70" w:type="dxa"/>
-              <w:end w:w="90" w:type="dxa"/>
+              <w:right w:w="90" w:type="dxa"/>
             </w:tcMar>
             <w:vAlign w:val="center"/>
-            <w:shd w:fill="D9E2F3"/>
           </w:tcPr>
           <w:p>
             <w:pPr>
-              <w:spacing w:before="0" w:after="0" w:line="240" w:lineRule="auto"/>
+              <w:spacing w:line="240" w:lineRule="auto"/>
               <w:jc w:val="center"/>
             </w:pPr>
             <w:r>
               <w:rPr>
-                <w:rFonts w:ascii="Times New Roman" w:hAnsi="Times New Roman" w:cs="Times New Roman" w:eastAsia="ＭＳ ゴシック"/>
+                <w:rFonts w:eastAsia="ＭＳ ゴシック"/>
                 <w:b/>
                 <w:sz w:val="18"/>
               </w:rPr>
@@ -388,107 +772,132 @@
         </w:tc>
         <w:tc>
           <w:tcPr>
-            <w:tcW w:type="dxa" w:w="1100"/>
+            <w:tcW w:w="1350" w:type="dxa"/>
+            <w:shd w:val="clear" w:color="auto" w:fill="D9E2F3"/>
             <w:tcMar>
               <w:top w:w="70" w:type="dxa"/>
-              <w:start w:w="90" w:type="dxa"/>
+              <w:left w:w="90" w:type="dxa"/>
               <w:bottom w:w="70" w:type="dxa"/>
-              <w:end w:w="90" w:type="dxa"/>
+              <w:right w:w="90" w:type="dxa"/>
             </w:tcMar>
             <w:vAlign w:val="center"/>
-            <w:shd w:fill="D9E2F3"/>
           </w:tcPr>
           <w:p>
             <w:pPr>
-              <w:spacing w:before="0" w:after="0" w:line="240" w:lineRule="auto"/>
+              <w:spacing w:line="240" w:lineRule="auto"/>
               <w:jc w:val="center"/>
             </w:pPr>
             <w:r>
               <w:rPr>
-                <w:rFonts w:ascii="Times New Roman" w:hAnsi="Times New Roman" w:cs="Times New Roman" w:eastAsia="ＭＳ ゴシック"/>
+                <w:rFonts w:eastAsia="ＭＳ ゴシック"/>
                 <w:b/>
                 <w:sz w:val="18"/>
               </w:rPr>
-              <w:t>正確p</w:t>
+              <w:t>Holm</w:t>
+            </w:r>
+            <w:r>
+              <w:rPr>
+                <w:rFonts w:eastAsia="ＭＳ ゴシック"/>
+                <w:b/>
+                <w:sz w:val="18"/>
+              </w:rPr>
+              <w:t>補正</w:t>
+            </w:r>
+            <w:r>
+              <w:rPr>
+                <w:rFonts w:eastAsia="ＭＳ ゴシック"/>
+                <w:b/>
+                <w:sz w:val="18"/>
+              </w:rPr>
+              <w:t>p</w:t>
             </w:r>
           </w:p>
         </w:tc>
         <w:tc>
           <w:tcPr>
-            <w:tcW w:type="dxa" w:w="1100"/>
+            <w:tcW w:w="2350" w:type="dxa"/>
+            <w:shd w:val="clear" w:color="auto" w:fill="D9E2F3"/>
             <w:tcMar>
               <w:top w:w="70" w:type="dxa"/>
-              <w:start w:w="90" w:type="dxa"/>
+              <w:left w:w="90" w:type="dxa"/>
               <w:bottom w:w="70" w:type="dxa"/>
-              <w:end w:w="90" w:type="dxa"/>
+              <w:right w:w="90" w:type="dxa"/>
             </w:tcMar>
             <w:vAlign w:val="center"/>
-            <w:shd w:fill="D9E2F3"/>
           </w:tcPr>
           <w:p>
             <w:pPr>
-              <w:spacing w:before="0" w:after="0" w:line="240" w:lineRule="auto"/>
+              <w:spacing w:line="240" w:lineRule="auto"/>
               <w:jc w:val="center"/>
             </w:pPr>
             <w:r>
               <w:rPr>
-                <w:rFonts w:ascii="Times New Roman" w:hAnsi="Times New Roman" w:cs="Times New Roman" w:eastAsia="ＭＳ ゴシック"/>
+                <w:rFonts w:eastAsia="ＭＳ ゴシック"/>
                 <w:b/>
                 <w:sz w:val="18"/>
               </w:rPr>
-              <w:t>Holm p</w:t>
+              <w:t>階層</w:t>
+            </w:r>
+            <w:r>
+              <w:rPr>
+                <w:rFonts w:eastAsia="ＭＳ ゴシック"/>
+                <w:b/>
+                <w:sz w:val="18"/>
+              </w:rPr>
+              <w:t>bootstrap 95% CI</w:t>
             </w:r>
           </w:p>
         </w:tc>
         <w:tc>
           <w:tcPr>
-            <w:tcW w:type="dxa" w:w="3800"/>
+            <w:tcW w:w="2350" w:type="dxa"/>
+            <w:shd w:val="clear" w:color="auto" w:fill="D9E2F3"/>
             <w:tcMar>
               <w:top w:w="70" w:type="dxa"/>
-              <w:start w:w="90" w:type="dxa"/>
+              <w:left w:w="90" w:type="dxa"/>
               <w:bottom w:w="70" w:type="dxa"/>
-              <w:end w:w="90" w:type="dxa"/>
+              <w:right w:w="90" w:type="dxa"/>
             </w:tcMar>
             <w:vAlign w:val="center"/>
-            <w:shd w:fill="D9E2F3"/>
           </w:tcPr>
           <w:p>
             <w:pPr>
-              <w:spacing w:before="0" w:after="0" w:line="240" w:lineRule="auto"/>
+              <w:spacing w:line="240" w:lineRule="auto"/>
               <w:jc w:val="center"/>
             </w:pPr>
             <w:r>
               <w:rPr>
-                <w:rFonts w:ascii="Times New Roman" w:hAnsi="Times New Roman" w:cs="Times New Roman" w:eastAsia="ＭＳ ゴシック"/>
+                <w:rFonts w:eastAsia="ＭＳ ゴシック"/>
                 <w:b/>
                 <w:sz w:val="18"/>
               </w:rPr>
-              <w:t>階層bootstrap 95% CI</w:t>
+              <w:t>現段階の判断</w:t>
             </w:r>
           </w:p>
         </w:tc>
       </w:tr>
       <w:tr>
+        <w:trPr>
+          <w:jc w:val="center"/>
+        </w:trPr>
         <w:tc>
           <w:tcPr>
-            <w:tcW w:type="dxa" w:w="1150"/>
+            <w:tcW w:w="1200" w:type="dxa"/>
             <w:tcMar>
               <w:top w:w="70" w:type="dxa"/>
-              <w:start w:w="90" w:type="dxa"/>
+              <w:left w:w="90" w:type="dxa"/>
               <w:bottom w:w="70" w:type="dxa"/>
-              <w:end w:w="90" w:type="dxa"/>
+              <w:right w:w="90" w:type="dxa"/>
             </w:tcMar>
             <w:vAlign w:val="center"/>
           </w:tcPr>
           <w:p>
             <w:pPr>
-              <w:spacing w:before="0" w:after="0" w:line="240" w:lineRule="auto"/>
+              <w:spacing w:line="240" w:lineRule="auto"/>
               <w:jc w:val="center"/>
             </w:pPr>
             <w:r>
               <w:rPr>
-                <w:rFonts w:ascii="Times New Roman" w:hAnsi="Times New Roman" w:cs="Times New Roman" w:eastAsia="ＭＳ 明朝"/>
-                <w:b w:val="0"/>
                 <w:sz w:val="18"/>
               </w:rPr>
               <w:t>Valence</w:t>
@@ -497,24 +906,22 @@
         </w:tc>
         <w:tc>
           <w:tcPr>
-            <w:tcW w:type="dxa" w:w="1300"/>
+            <w:tcW w:w="1350" w:type="dxa"/>
             <w:tcMar>
               <w:top w:w="70" w:type="dxa"/>
-              <w:start w:w="90" w:type="dxa"/>
+              <w:left w:w="90" w:type="dxa"/>
               <w:bottom w:w="70" w:type="dxa"/>
-              <w:end w:w="90" w:type="dxa"/>
+              <w:right w:w="90" w:type="dxa"/>
             </w:tcMar>
             <w:vAlign w:val="center"/>
           </w:tcPr>
           <w:p>
             <w:pPr>
-              <w:spacing w:before="0" w:after="0" w:line="240" w:lineRule="auto"/>
+              <w:spacing w:line="240" w:lineRule="auto"/>
               <w:jc w:val="center"/>
             </w:pPr>
             <w:r>
               <w:rPr>
-                <w:rFonts w:ascii="Times New Roman" w:hAnsi="Times New Roman" w:cs="Times New Roman" w:eastAsia="ＭＳ 明朝"/>
-                <w:b w:val="0"/>
                 <w:sz w:val="18"/>
               </w:rPr>
               <w:t>.875</w:t>
@@ -523,104 +930,111 @@
         </w:tc>
         <w:tc>
           <w:tcPr>
-            <w:tcW w:type="dxa" w:w="1100"/>
+            <w:tcW w:w="1350" w:type="dxa"/>
             <w:tcMar>
               <w:top w:w="70" w:type="dxa"/>
-              <w:start w:w="90" w:type="dxa"/>
+              <w:left w:w="90" w:type="dxa"/>
               <w:bottom w:w="70" w:type="dxa"/>
-              <w:end w:w="90" w:type="dxa"/>
+              <w:right w:w="90" w:type="dxa"/>
             </w:tcMar>
             <w:vAlign w:val="center"/>
           </w:tcPr>
           <w:p>
             <w:pPr>
-              <w:spacing w:before="0" w:after="0" w:line="240" w:lineRule="auto"/>
+              <w:spacing w:line="240" w:lineRule="auto"/>
               <w:jc w:val="center"/>
             </w:pPr>
             <w:r>
               <w:rPr>
-                <w:rFonts w:ascii="Times New Roman" w:hAnsi="Times New Roman" w:cs="Times New Roman" w:eastAsia="ＭＳ 明朝"/>
-                <w:b w:val="0"/>
                 <w:sz w:val="18"/>
               </w:rPr>
-              <w:t>.0061</w:t>
+              <w:t>.018</w:t>
             </w:r>
           </w:p>
         </w:tc>
         <w:tc>
           <w:tcPr>
-            <w:tcW w:type="dxa" w:w="1100"/>
+            <w:tcW w:w="2350" w:type="dxa"/>
             <w:tcMar>
               <w:top w:w="70" w:type="dxa"/>
-              <w:start w:w="90" w:type="dxa"/>
+              <w:left w:w="90" w:type="dxa"/>
               <w:bottom w:w="70" w:type="dxa"/>
-              <w:end w:w="90" w:type="dxa"/>
+              <w:right w:w="90" w:type="dxa"/>
             </w:tcMar>
             <w:vAlign w:val="center"/>
           </w:tcPr>
           <w:p>
             <w:pPr>
-              <w:spacing w:before="0" w:after="0" w:line="240" w:lineRule="auto"/>
+              <w:spacing w:line="240" w:lineRule="auto"/>
               <w:jc w:val="center"/>
             </w:pPr>
             <w:r>
               <w:rPr>
-                <w:rFonts w:ascii="Times New Roman" w:hAnsi="Times New Roman" w:cs="Times New Roman" w:eastAsia="ＭＳ 明朝"/>
-                <w:b w:val="0"/>
                 <w:sz w:val="18"/>
               </w:rPr>
-              <w:t>.0184</w:t>
+              <w:t>[.762</w:t>
+            </w:r>
+            <w:r>
+              <w:rPr>
+                <w:sz w:val="18"/>
+              </w:rPr>
+              <w:t>，</w:t>
+            </w:r>
+            <w:r>
+              <w:rPr>
+                <w:sz w:val="18"/>
+              </w:rPr>
+              <w:t>.920]</w:t>
             </w:r>
           </w:p>
         </w:tc>
         <w:tc>
           <w:tcPr>
-            <w:tcW w:type="dxa" w:w="3800"/>
+            <w:tcW w:w="2350" w:type="dxa"/>
             <w:tcMar>
               <w:top w:w="70" w:type="dxa"/>
-              <w:start w:w="90" w:type="dxa"/>
+              <w:left w:w="90" w:type="dxa"/>
               <w:bottom w:w="70" w:type="dxa"/>
-              <w:end w:w="90" w:type="dxa"/>
+              <w:right w:w="90" w:type="dxa"/>
             </w:tcMar>
             <w:vAlign w:val="center"/>
           </w:tcPr>
           <w:p>
             <w:pPr>
-              <w:spacing w:before="0" w:after="0" w:line="240" w:lineRule="auto"/>
+              <w:spacing w:line="240" w:lineRule="auto"/>
               <w:jc w:val="center"/>
             </w:pPr>
             <w:r>
               <w:rPr>
-                <w:rFonts w:ascii="Times New Roman" w:hAnsi="Times New Roman" w:cs="Times New Roman" w:eastAsia="ＭＳ 明朝"/>
-                <w:b w:val="0"/>
                 <w:sz w:val="18"/>
               </w:rPr>
-              <w:t>[.762，.920]</w:t>
+              <w:t>相対構造は安定</w:t>
             </w:r>
           </w:p>
         </w:tc>
       </w:tr>
       <w:tr>
+        <w:trPr>
+          <w:jc w:val="center"/>
+        </w:trPr>
         <w:tc>
           <w:tcPr>
-            <w:tcW w:type="dxa" w:w="1150"/>
+            <w:tcW w:w="1200" w:type="dxa"/>
             <w:tcMar>
               <w:top w:w="70" w:type="dxa"/>
-              <w:start w:w="90" w:type="dxa"/>
+              <w:left w:w="90" w:type="dxa"/>
               <w:bottom w:w="70" w:type="dxa"/>
-              <w:end w:w="90" w:type="dxa"/>
+              <w:right w:w="90" w:type="dxa"/>
             </w:tcMar>
             <w:vAlign w:val="center"/>
           </w:tcPr>
           <w:p>
             <w:pPr>
-              <w:spacing w:before="0" w:after="0" w:line="240" w:lineRule="auto"/>
+              <w:spacing w:line="240" w:lineRule="auto"/>
               <w:jc w:val="center"/>
             </w:pPr>
             <w:r>
               <w:rPr>
-                <w:rFonts w:ascii="Times New Roman" w:hAnsi="Times New Roman" w:cs="Times New Roman" w:eastAsia="ＭＳ 明朝"/>
-                <w:b w:val="0"/>
                 <w:sz w:val="18"/>
               </w:rPr>
               <w:t>Arousal</w:t>
@@ -629,24 +1043,22 @@
         </w:tc>
         <w:tc>
           <w:tcPr>
-            <w:tcW w:type="dxa" w:w="1300"/>
+            <w:tcW w:w="1350" w:type="dxa"/>
             <w:tcMar>
               <w:top w:w="70" w:type="dxa"/>
-              <w:start w:w="90" w:type="dxa"/>
+              <w:left w:w="90" w:type="dxa"/>
               <w:bottom w:w="70" w:type="dxa"/>
-              <w:end w:w="90" w:type="dxa"/>
+              <w:right w:w="90" w:type="dxa"/>
             </w:tcMar>
             <w:vAlign w:val="center"/>
           </w:tcPr>
           <w:p>
             <w:pPr>
-              <w:spacing w:before="0" w:after="0" w:line="240" w:lineRule="auto"/>
+              <w:spacing w:line="240" w:lineRule="auto"/>
               <w:jc w:val="center"/>
             </w:pPr>
             <w:r>
               <w:rPr>
-                <w:rFonts w:ascii="Times New Roman" w:hAnsi="Times New Roman" w:cs="Times New Roman" w:eastAsia="ＭＳ 明朝"/>
-                <w:b w:val="0"/>
                 <w:sz w:val="18"/>
               </w:rPr>
               <w:t>.832</w:t>
@@ -655,104 +1067,111 @@
         </w:tc>
         <w:tc>
           <w:tcPr>
-            <w:tcW w:type="dxa" w:w="1100"/>
+            <w:tcW w:w="1350" w:type="dxa"/>
             <w:tcMar>
               <w:top w:w="70" w:type="dxa"/>
-              <w:start w:w="90" w:type="dxa"/>
+              <w:left w:w="90" w:type="dxa"/>
               <w:bottom w:w="70" w:type="dxa"/>
-              <w:end w:w="90" w:type="dxa"/>
+              <w:right w:w="90" w:type="dxa"/>
             </w:tcMar>
             <w:vAlign w:val="center"/>
           </w:tcPr>
           <w:p>
             <w:pPr>
-              <w:spacing w:before="0" w:after="0" w:line="240" w:lineRule="auto"/>
+              <w:spacing w:line="240" w:lineRule="auto"/>
               <w:jc w:val="center"/>
             </w:pPr>
             <w:r>
               <w:rPr>
-                <w:rFonts w:ascii="Times New Roman" w:hAnsi="Times New Roman" w:cs="Times New Roman" w:eastAsia="ＭＳ 明朝"/>
-                <w:b w:val="0"/>
                 <w:sz w:val="18"/>
               </w:rPr>
-              <w:t>.0169</w:t>
+              <w:t>.034</w:t>
             </w:r>
           </w:p>
         </w:tc>
         <w:tc>
           <w:tcPr>
-            <w:tcW w:type="dxa" w:w="1100"/>
+            <w:tcW w:w="2350" w:type="dxa"/>
             <w:tcMar>
               <w:top w:w="70" w:type="dxa"/>
-              <w:start w:w="90" w:type="dxa"/>
+              <w:left w:w="90" w:type="dxa"/>
               <w:bottom w:w="70" w:type="dxa"/>
-              <w:end w:w="90" w:type="dxa"/>
+              <w:right w:w="90" w:type="dxa"/>
             </w:tcMar>
             <w:vAlign w:val="center"/>
           </w:tcPr>
           <w:p>
             <w:pPr>
-              <w:spacing w:before="0" w:after="0" w:line="240" w:lineRule="auto"/>
+              <w:spacing w:line="240" w:lineRule="auto"/>
               <w:jc w:val="center"/>
             </w:pPr>
             <w:r>
               <w:rPr>
-                <w:rFonts w:ascii="Times New Roman" w:hAnsi="Times New Roman" w:cs="Times New Roman" w:eastAsia="ＭＳ 明朝"/>
-                <w:b w:val="0"/>
                 <w:sz w:val="18"/>
               </w:rPr>
-              <w:t>.0339</w:t>
+              <w:t>[.370</w:t>
+            </w:r>
+            <w:r>
+              <w:rPr>
+                <w:sz w:val="18"/>
+              </w:rPr>
+              <w:t>，</w:t>
+            </w:r>
+            <w:r>
+              <w:rPr>
+                <w:sz w:val="18"/>
+              </w:rPr>
+              <w:t>.913]</w:t>
             </w:r>
           </w:p>
         </w:tc>
         <w:tc>
           <w:tcPr>
-            <w:tcW w:type="dxa" w:w="3800"/>
+            <w:tcW w:w="2350" w:type="dxa"/>
             <w:tcMar>
               <w:top w:w="70" w:type="dxa"/>
-              <w:start w:w="90" w:type="dxa"/>
+              <w:left w:w="90" w:type="dxa"/>
               <w:bottom w:w="70" w:type="dxa"/>
-              <w:end w:w="90" w:type="dxa"/>
+              <w:right w:w="90" w:type="dxa"/>
             </w:tcMar>
             <w:vAlign w:val="center"/>
           </w:tcPr>
           <w:p>
             <w:pPr>
-              <w:spacing w:before="0" w:after="0" w:line="240" w:lineRule="auto"/>
+              <w:spacing w:line="240" w:lineRule="auto"/>
               <w:jc w:val="center"/>
             </w:pPr>
             <w:r>
               <w:rPr>
-                <w:rFonts w:ascii="Times New Roman" w:hAnsi="Times New Roman" w:cs="Times New Roman" w:eastAsia="ＭＳ 明朝"/>
-                <w:b w:val="0"/>
                 <w:sz w:val="18"/>
               </w:rPr>
-              <w:t>[.370，.913]</w:t>
+              <w:t>正の対応・要検証</w:t>
             </w:r>
           </w:p>
         </w:tc>
       </w:tr>
       <w:tr>
+        <w:trPr>
+          <w:jc w:val="center"/>
+        </w:trPr>
         <w:tc>
           <w:tcPr>
-            <w:tcW w:type="dxa" w:w="1150"/>
+            <w:tcW w:w="1200" w:type="dxa"/>
             <w:tcMar>
               <w:top w:w="70" w:type="dxa"/>
-              <w:start w:w="90" w:type="dxa"/>
+              <w:left w:w="90" w:type="dxa"/>
               <w:bottom w:w="70" w:type="dxa"/>
-              <w:end w:w="90" w:type="dxa"/>
+              <w:right w:w="90" w:type="dxa"/>
             </w:tcMar>
             <w:vAlign w:val="center"/>
           </w:tcPr>
           <w:p>
             <w:pPr>
-              <w:spacing w:before="0" w:after="0" w:line="240" w:lineRule="auto"/>
+              <w:spacing w:line="240" w:lineRule="auto"/>
               <w:jc w:val="center"/>
             </w:pPr>
             <w:r>
               <w:rPr>
-                <w:rFonts w:ascii="Times New Roman" w:hAnsi="Times New Roman" w:cs="Times New Roman" w:eastAsia="ＭＳ 明朝"/>
-                <w:b w:val="0"/>
                 <w:sz w:val="18"/>
               </w:rPr>
               <w:t>Dominance</w:t>
@@ -761,24 +1180,22 @@
         </w:tc>
         <w:tc>
           <w:tcPr>
-            <w:tcW w:type="dxa" w:w="1300"/>
+            <w:tcW w:w="1350" w:type="dxa"/>
             <w:tcMar>
               <w:top w:w="70" w:type="dxa"/>
-              <w:start w:w="90" w:type="dxa"/>
+              <w:left w:w="90" w:type="dxa"/>
               <w:bottom w:w="70" w:type="dxa"/>
-              <w:end w:w="90" w:type="dxa"/>
+              <w:right w:w="90" w:type="dxa"/>
             </w:tcMar>
             <w:vAlign w:val="center"/>
           </w:tcPr>
           <w:p>
             <w:pPr>
-              <w:spacing w:before="0" w:after="0" w:line="240" w:lineRule="auto"/>
+              <w:spacing w:line="240" w:lineRule="auto"/>
               <w:jc w:val="center"/>
             </w:pPr>
             <w:r>
               <w:rPr>
-                <w:rFonts w:ascii="Times New Roman" w:hAnsi="Times New Roman" w:cs="Times New Roman" w:eastAsia="ＭＳ 明朝"/>
-                <w:b w:val="0"/>
                 <w:sz w:val="18"/>
               </w:rPr>
               <w:t>-.121</w:t>
@@ -787,79 +1204,85 @@
         </w:tc>
         <w:tc>
           <w:tcPr>
-            <w:tcW w:type="dxa" w:w="1100"/>
+            <w:tcW w:w="1350" w:type="dxa"/>
             <w:tcMar>
               <w:top w:w="70" w:type="dxa"/>
-              <w:start w:w="90" w:type="dxa"/>
+              <w:left w:w="90" w:type="dxa"/>
               <w:bottom w:w="70" w:type="dxa"/>
-              <w:end w:w="90" w:type="dxa"/>
+              <w:right w:w="90" w:type="dxa"/>
             </w:tcMar>
             <w:vAlign w:val="center"/>
           </w:tcPr>
           <w:p>
             <w:pPr>
-              <w:spacing w:before="0" w:after="0" w:line="240" w:lineRule="auto"/>
+              <w:spacing w:line="240" w:lineRule="auto"/>
               <w:jc w:val="center"/>
             </w:pPr>
             <w:r>
               <w:rPr>
-                <w:rFonts w:ascii="Times New Roman" w:hAnsi="Times New Roman" w:cs="Times New Roman" w:eastAsia="ＭＳ 明朝"/>
-                <w:b w:val="0"/>
                 <w:sz w:val="18"/>
               </w:rPr>
-              <w:t>.7923</w:t>
+              <w:t>.792</w:t>
             </w:r>
           </w:p>
         </w:tc>
         <w:tc>
           <w:tcPr>
-            <w:tcW w:type="dxa" w:w="1100"/>
+            <w:tcW w:w="2350" w:type="dxa"/>
             <w:tcMar>
               <w:top w:w="70" w:type="dxa"/>
-              <w:start w:w="90" w:type="dxa"/>
+              <w:left w:w="90" w:type="dxa"/>
               <w:bottom w:w="70" w:type="dxa"/>
-              <w:end w:w="90" w:type="dxa"/>
+              <w:right w:w="90" w:type="dxa"/>
             </w:tcMar>
             <w:vAlign w:val="center"/>
           </w:tcPr>
           <w:p>
             <w:pPr>
-              <w:spacing w:before="0" w:after="0" w:line="240" w:lineRule="auto"/>
+              <w:spacing w:line="240" w:lineRule="auto"/>
               <w:jc w:val="center"/>
             </w:pPr>
             <w:r>
               <w:rPr>
-                <w:rFonts w:ascii="Times New Roman" w:hAnsi="Times New Roman" w:cs="Times New Roman" w:eastAsia="ＭＳ 明朝"/>
-                <w:b w:val="0"/>
                 <w:sz w:val="18"/>
               </w:rPr>
-              <w:t>.7923</w:t>
+              <w:t>[-.432</w:t>
+            </w:r>
+            <w:r>
+              <w:rPr>
+                <w:sz w:val="18"/>
+              </w:rPr>
+              <w:t>，</w:t>
+            </w:r>
+            <w:r>
+              <w:rPr>
+                <w:sz w:val="18"/>
+              </w:rPr>
+              <w:t>.280]</w:t>
             </w:r>
           </w:p>
         </w:tc>
         <w:tc>
           <w:tcPr>
-            <w:tcW w:type="dxa" w:w="3800"/>
+            <w:tcW w:w="2350" w:type="dxa"/>
             <w:tcMar>
               <w:top w:w="70" w:type="dxa"/>
-              <w:start w:w="90" w:type="dxa"/>
+              <w:left w:w="90" w:type="dxa"/>
               <w:bottom w:w="70" w:type="dxa"/>
-              <w:end w:w="90" w:type="dxa"/>
+              <w:right w:w="90" w:type="dxa"/>
             </w:tcMar>
             <w:vAlign w:val="center"/>
           </w:tcPr>
           <w:p>
             <w:pPr>
-              <w:spacing w:before="0" w:after="0" w:line="240" w:lineRule="auto"/>
+              <w:spacing w:line="240" w:lineRule="auto"/>
               <w:jc w:val="center"/>
             </w:pPr>
             <w:r>
               <w:rPr>
-                <w:rFonts w:ascii="Times New Roman" w:hAnsi="Times New Roman" w:cs="Times New Roman" w:eastAsia="ＭＳ 明朝"/>
-                <w:b w:val="0"/>
                 <w:sz w:val="18"/>
               </w:rPr>
-              <w:t>[-.432，.280]</w:t>
+              <w:t>明確な対応なし</w:t>
             </w:r>
           </w:p>
         </w:tc>
@@ -870,7 +1293,7 @@
         <w:sectPr>
           <w:pgSz w:w="11906" w:h="16838"/>
           <w:pgMar w:top="1138" w:right="1310" w:bottom="1138" w:left="1310" w:header="283" w:footer="283" w:gutter="0"/>
-          <w:cols w:num="1" w:space="360" w:equalWidth="1"/>
+          <w:cols w:space="360"/>
         </w:sectPr>
       </w:pPr>
     </w:p>
@@ -881,56 +1304,113 @@
       </w:pPr>
       <w:r>
         <w:rPr>
-          <w:rFonts w:ascii="Times New Roman" w:hAnsi="Times New Roman" w:cs="Times New Roman" w:eastAsia="ＭＳ ゴシック"/>
+          <w:rFonts w:eastAsia="ＭＳ ゴシック"/>
           <w:b/>
-          <w:sz w:val="20"/>
-        </w:rPr>
-        <w:t>4 結果（続き）</w:t>
-      </w:r>
-    </w:p>
-    <w:p>
-      <w:pPr>
-        <w:keepLines w:val="0"/>
+        </w:rPr>
+        <w:t xml:space="preserve">4 </w:t>
+      </w:r>
+      <w:r>
+        <w:rPr>
+          <w:rFonts w:eastAsia="ＭＳ ゴシック"/>
+          <w:b/>
+        </w:rPr>
+        <w:t>結果（続き）</w:t>
+      </w:r>
+    </w:p>
+    <w:p>
+      <w:pPr>
         <w:widowControl/>
-        <w:spacing w:before="0" w:after="0" w:line="252" w:lineRule="auto"/>
         <w:ind w:firstLine="200"/>
       </w:pPr>
       <w:r>
-        <w:rPr>
-          <w:rFonts w:ascii="Times New Roman" w:hAnsi="Times New Roman" w:cs="Times New Roman" w:eastAsia="ＭＳ 明朝"/>
-          <w:sz w:val="20"/>
-        </w:rPr>
-        <w:t>NRCからDREAMERへの回帰傾きはV = .520，A = .341，D = -.055であり，VとAでは誘発評定が語彙規範より中立点付近へ圧縮されていた．LOEO校正後はcalmnessのVAD残差が最大であったが（.759，95% CI [.538，1.036]），感情間の区間は広く重複したため，確定的順位ではなく優先的再検証対象と解釈した．</w:t>
-      </w:r>
-    </w:p>
-    <w:p>
-      <w:pPr>
-        <w:keepLines w:val="0"/>
+        <w:t>Valence</w:t>
+      </w:r>
+      <w:r>
+        <w:t>の回帰傾きは</w:t>
+      </w:r>
+      <w:r>
+        <w:t>.520</w:t>
+      </w:r>
+      <w:r>
+        <w:t>であった．</w:t>
+      </w:r>
+      <w:r>
+        <w:t>Arousal</w:t>
+      </w:r>
+      <w:r>
+        <w:t>は</w:t>
+      </w:r>
+      <w:r>
+        <w:t>.341</w:t>
+      </w:r>
+      <w:r>
+        <w:t>であった．どちらも</w:t>
+      </w:r>
+      <w:r>
+        <w:t>1</w:t>
+      </w:r>
+      <w:r>
+        <w:t>より小さい．そのため，情動体験評価は意味的評価より中立点付近に集まっていた．つまり，</w:t>
+      </w:r>
+      <w:r>
+        <w:t>V</w:t>
+      </w:r>
+      <w:r>
+        <w:t>と</w:t>
+      </w:r>
+      <w:r>
+        <w:t>A</w:t>
+      </w:r>
+      <w:r>
+        <w:t>では相対構造が似ていても，値の広がりは異なった．</w:t>
+      </w:r>
+    </w:p>
+    <w:p>
+      <w:pPr>
         <w:widowControl/>
-        <w:spacing w:before="0" w:after="0" w:line="252" w:lineRule="auto"/>
         <w:ind w:firstLine="200"/>
       </w:pPr>
       <w:r>
-        <w:rPr>
-          <w:rFonts w:ascii="Times New Roman" w:hAnsi="Times New Roman" w:cs="Times New Roman" w:eastAsia="ＭＳ 明朝"/>
-          <w:sz w:val="20"/>
-        </w:rPr>
-        <w:t>逐一除外後のPearson rは，Vで.848-.922，Aで.482-.898，Dで-.574-.049であった．また，EEG相対帯域パワー，前頭部alpha非対称性，心拍数，RMSSD及びSDNNは，Holm補正後にVAD乖離を有意に説明しなかった．これは生理反応の不存在ではなく，23名，低密度EEG，各感情2映像及び60 s平均という感度上の制約を示す．</w:t>
-      </w:r>
-    </w:p>
-    <w:p>
-      <w:pPr>
-        <w:keepLines w:val="0"/>
-        <w:widowControl/>
-        <w:spacing w:before="0" w:after="0" w:line="252" w:lineRule="auto"/>
-        <w:ind w:firstLine="200"/>
-      </w:pPr>
-      <w:r>
-        <w:rPr>
-          <w:rFonts w:ascii="Times New Roman" w:hAnsi="Times New Roman" w:cs="Times New Roman" w:eastAsia="ＭＳ 明朝"/>
-          <w:sz w:val="20"/>
-        </w:rPr>
-        <w:t>語形を名詞から形容詞へ変更しても次元別の結論は変わらなかった．Dominanceを反転すると相関の符号は変化したが有意性は回復せず，不一致が単純な符号設定だけに由来するとはいえなかった．一方，Arousalはcalmnessを除くと相関が大きく変化し，少数カテゴリーへの依存が確認された．</w:t>
+        <w:t>CASE</w:t>
+      </w:r>
+      <w:r>
+        <w:t>でも</w:t>
+      </w:r>
+      <w:r>
+        <w:t>V</w:t>
+      </w:r>
+      <w:r>
+        <w:t>と</w:t>
+      </w:r>
+      <w:r>
+        <w:t>A</w:t>
+      </w:r>
+      <w:r>
+        <w:t>は同じ向きの関連を示した．しかし，共通感情は</w:t>
+      </w:r>
+      <w:r>
+        <w:t>4</w:t>
+      </w:r>
+      <w:r>
+        <w:t>カテゴリーであった．</w:t>
+      </w:r>
+      <w:r>
+        <w:t>D</w:t>
+      </w:r>
+      <w:r>
+        <w:t>も含まれない．そのため，</w:t>
+      </w:r>
+      <w:r>
+        <w:t>CASE</w:t>
+      </w:r>
+      <w:r>
+        <w:t>の結果は補足的に扱った．</w:t>
+      </w:r>
+      <w:r>
+        <w:t>DREAMER</w:t>
+      </w:r>
+      <w:r>
+        <w:t>の再現とは判断しなかった．</w:t>
       </w:r>
     </w:p>
     <w:p>
@@ -940,41 +1420,77 @@
       </w:pPr>
       <w:r>
         <w:rPr>
-          <w:rFonts w:ascii="Times New Roman" w:hAnsi="Times New Roman" w:cs="Times New Roman" w:eastAsia="ＭＳ ゴシック"/>
+          <w:rFonts w:eastAsia="ＭＳ ゴシック"/>
           <w:b/>
-          <w:sz w:val="20"/>
-        </w:rPr>
-        <w:t>5 考察</w:t>
-      </w:r>
-    </w:p>
-    <w:p>
-      <w:pPr>
-        <w:keepLines w:val="0"/>
+        </w:rPr>
+        <w:t xml:space="preserve">5 </w:t>
+      </w:r>
+      <w:r>
+        <w:rPr>
+          <w:rFonts w:eastAsia="ＭＳ ゴシック"/>
+          <w:b/>
+        </w:rPr>
+        <w:t>考察</w:t>
+      </w:r>
+    </w:p>
+    <w:p>
+      <w:pPr>
         <w:widowControl/>
-        <w:spacing w:before="0" w:after="0" w:line="252" w:lineRule="auto"/>
         <w:ind w:firstLine="200"/>
       </w:pPr>
       <w:r>
-        <w:rPr>
-          <w:rFonts w:ascii="Times New Roman" w:hAnsi="Times New Roman" w:cs="Times New Roman" w:eastAsia="ＭＳ 明朝"/>
-          <w:sz w:val="20"/>
-        </w:rPr>
-        <w:t>結果は，語彙知識と誘発体験が「関連するが同一ではない」ことを示す[4，5]．Valenceは文脈間の橋渡しに利用できる可能性が高い一方，Arousalには尺度校正と感情別確認が必要である．Dominanceは，語の強さと体験者の統制感で参照対象が異なる可能性があり，原SAM画面の方向確認なしに直接転用すべきではない．また，高い相関は絶対座標の一致や測定不変性を意味しない．</w:t>
-      </w:r>
-    </w:p>
-    <w:p>
-      <w:pPr>
-        <w:keepLines w:val="0"/>
+        <w:t>Valence</w:t>
+      </w:r>
+      <w:r>
+        <w:t>では，相対構造が比較的よく保たれた．一方，値は中立点方向に縮んでいた．したがって，感情カテゴリーの並び方は似ている．しかし，数値そのものは一致しない．</w:t>
+      </w:r>
+    </w:p>
+    <w:p>
+      <w:pPr>
         <w:widowControl/>
-        <w:spacing w:before="0" w:after="0" w:line="252" w:lineRule="auto"/>
         <w:ind w:firstLine="200"/>
       </w:pPr>
       <w:r>
-        <w:rPr>
-          <w:rFonts w:ascii="Times New Roman" w:hAnsi="Times New Roman" w:cs="Times New Roman" w:eastAsia="ＭＳ 明朝"/>
-          <w:sz w:val="20"/>
-        </w:rPr>
-        <w:t>とりわけVとAの回帰傾きが1を大きく下回ったことは，映像誘発評定が中立点周辺へ集まりやすいことを示す．したがって語彙座標を刺激ラベルへ転用する際には，相対的な順序の保存と絶対値の再現を別々に判断し，学習データやデータベースごとに切片と傾きを再推定する必要がある．</w:t>
+        <w:t>Arousal</w:t>
+      </w:r>
+      <w:r>
+        <w:t>では</w:t>
+      </w:r>
+      <w:r>
+        <w:t>Pearson</w:t>
+      </w:r>
+      <w:r>
+        <w:t>相関は高かった．しかし，順位対応と</w:t>
+      </w:r>
+      <w:r>
+        <w:t>bootstrap</w:t>
+      </w:r>
+      <w:r>
+        <w:t>区間は</w:t>
+      </w:r>
+      <w:r>
+        <w:t>Valence</w:t>
+      </w:r>
+      <w:r>
+        <w:t>より不安定であった．</w:t>
+      </w:r>
+      <w:r>
+        <w:t>Arousal</w:t>
+      </w:r>
+      <w:r>
+        <w:t>は，刺激の強さやカテゴリー構成の影響を受ける可能性がある．したがって，追加の検証が必要である．</w:t>
+      </w:r>
+    </w:p>
+    <w:p>
+      <w:pPr>
+        <w:widowControl/>
+        <w:ind w:firstLine="200"/>
+      </w:pPr>
+      <w:r>
+        <w:t>Dominance</w:t>
+      </w:r>
+      <w:r>
+        <w:t>では対応が得られなかった．意味的評価では，語が一般に表す支配感を測る．情動体験評価では，特定場面で感じた制御感を測る可能性がある．この評価対象の違いが結果に影響した可能性がある．ただし，本研究だけでは原因を特定できない．</w:t>
       </w:r>
     </w:p>
     <w:p>
@@ -984,41 +1500,71 @@
       </w:pPr>
       <w:r>
         <w:rPr>
-          <w:rFonts w:ascii="Times New Roman" w:hAnsi="Times New Roman" w:cs="Times New Roman" w:eastAsia="ＭＳ ゴシック"/>
+          <w:rFonts w:eastAsia="ＭＳ ゴシック"/>
           <w:b/>
-          <w:sz w:val="20"/>
-        </w:rPr>
-        <w:t>6 研究の意義</w:t>
-      </w:r>
-    </w:p>
-    <w:p>
-      <w:pPr>
-        <w:keepLines w:val="0"/>
+        </w:rPr>
+        <w:t xml:space="preserve">6 </w:t>
+      </w:r>
+      <w:r>
+        <w:rPr>
+          <w:rFonts w:eastAsia="ＭＳ ゴシック"/>
+          <w:b/>
+        </w:rPr>
+        <w:t>現段階の学術的意義</w:t>
+      </w:r>
+    </w:p>
+    <w:p>
+      <w:pPr>
         <w:widowControl/>
-        <w:spacing w:before="0" w:after="0" w:line="252" w:lineRule="auto"/>
         <w:ind w:firstLine="200"/>
       </w:pPr>
       <w:r>
-        <w:rPr>
-          <w:rFonts w:ascii="Times New Roman" w:hAnsi="Times New Roman" w:cs="Times New Roman" w:eastAsia="ＭＳ 明朝"/>
-          <w:sz w:val="20"/>
-        </w:rPr>
-        <w:t>本研究の理論的意義は，語彙VADと誘発VADの比較を，どちらが「真の感情」を表すかという対立ではなく，異なる測定文脈間で構造がどこまで保存されるかという転用可能性の問題へ置き換えた点にある．方法的には，相関，アフィン写像，LOEO残差を組み合わせることで，高相関でも絶対座標が一致しない場合と，全体圧縮を除いても特定感情が乖離する場合を区別できる．</w:t>
-      </w:r>
-    </w:p>
-    <w:p>
-      <w:pPr>
-        <w:keepLines w:val="0"/>
+        <w:t>本研究では，「対応」と「一致」を分けた．相関は感情カテゴリーの並び方を表す．回帰傾きは値の広がりを表す．</w:t>
+      </w:r>
+      <w:r>
+        <w:t>Valence</w:t>
+      </w:r>
+      <w:r>
+        <w:t>では相関が高かった．しかし，傾きは</w:t>
+      </w:r>
+      <w:r>
+        <w:t>1</w:t>
+      </w:r>
+      <w:r>
+        <w:t>より小さかった．この結果は，高い相関だけでは数値的一致を示せないことを意味する．</w:t>
+      </w:r>
+    </w:p>
+    <w:p>
+      <w:pPr>
         <w:widowControl/>
-        <w:spacing w:before="0" w:after="0" w:line="252" w:lineRule="auto"/>
         <w:ind w:firstLine="200"/>
       </w:pPr>
       <w:r>
-        <w:rPr>
-          <w:rFonts w:ascii="Times New Roman" w:hAnsi="Times New Roman" w:cs="Times New Roman" w:eastAsia="ＭＳ 明朝"/>
-          <w:sz w:val="20"/>
-        </w:rPr>
-        <w:t>応用上は，Valenceを異種データ間の暫定的な橋渡しとし，Arousalはデータセット内で校正し，Dominanceは原尺度を確認するという次元別の運用基準を提示した．これは語彙辞書による映像注釈や異種データ統合に有用である．</w:t>
+        <w:t>また，</w:t>
+      </w:r>
+      <w:r>
+        <w:t>VAD</w:t>
+      </w:r>
+      <w:r>
+        <w:t>を一つのまとまりとして判断しなかった．</w:t>
+      </w:r>
+      <w:r>
+        <w:t>V</w:t>
+      </w:r>
+      <w:r>
+        <w:t>・</w:t>
+      </w:r>
+      <w:r>
+        <w:t>A</w:t>
+      </w:r>
+      <w:r>
+        <w:t>・</w:t>
+      </w:r>
+      <w:r>
+        <w:t>D</w:t>
+      </w:r>
+      <w:r>
+        <w:t>を別々に検討した．その結果，次元ごとに異なる対応が明らかになった．</w:t>
       </w:r>
     </w:p>
     <w:p>
@@ -1028,41 +1574,95 @@
       </w:pPr>
       <w:r>
         <w:rPr>
-          <w:rFonts w:ascii="Times New Roman" w:hAnsi="Times New Roman" w:cs="Times New Roman" w:eastAsia="ＭＳ ゴシック"/>
+          <w:rFonts w:eastAsia="ＭＳ ゴシック"/>
           <w:b/>
-          <w:sz w:val="20"/>
-        </w:rPr>
-        <w:t>7 制約</w:t>
-      </w:r>
-    </w:p>
-    <w:p>
-      <w:pPr>
-        <w:keepLines w:val="0"/>
+        </w:rPr>
+        <w:t xml:space="preserve">7 </w:t>
+      </w:r>
+      <w:r>
+        <w:rPr>
+          <w:rFonts w:eastAsia="ＭＳ ゴシック"/>
+          <w:b/>
+        </w:rPr>
+        <w:t>限界</w:t>
+      </w:r>
+    </w:p>
+    <w:p>
+      <w:pPr>
         <w:widowControl/>
-        <w:spacing w:before="0" w:after="0" w:line="252" w:lineRule="auto"/>
         <w:ind w:firstLine="200"/>
       </w:pPr>
       <w:r>
-        <w:rPr>
-          <w:rFonts w:ascii="Times New Roman" w:hAnsi="Times New Roman" w:cs="Times New Roman" w:eastAsia="ＭＳ 明朝"/>
-          <w:sz w:val="20"/>
-        </w:rPr>
-        <w:t>核心検定は9カテゴリーに限られ，各感情の映像も2本であるため，刺激差とカテゴリー差を完全には分離できない．また，NRC-VADとDREAMERは異なる参加者と課題から得られたため，個人内予測や因果的説明はできない．NRC評定者レベルの不確実性も現データからは伝播できず，感情別残差は探索的結果である．</w:t>
-      </w:r>
-    </w:p>
-    <w:p>
-      <w:pPr>
-        <w:keepLines w:val="0"/>
+        <w:t>第一に，主分析は</w:t>
+      </w:r>
+      <w:r>
+        <w:t>9</w:t>
+      </w:r>
+      <w:r>
+        <w:t>感情カテゴリーのみである．各カテゴリーの映像も</w:t>
+      </w:r>
+      <w:r>
+        <w:t>2</w:t>
+      </w:r>
+      <w:r>
+        <w:t>本だけである．そのため，感情カテゴリーの効果と映像固有の効果を分けにくい．第二に，</w:t>
+      </w:r>
+      <w:r>
+        <w:t>NRC-VAD</w:t>
+      </w:r>
+      <w:r>
+        <w:t>と</w:t>
+      </w:r>
+      <w:r>
+        <w:t>DREAMER</w:t>
+      </w:r>
+      <w:r>
+        <w:t>の参加者は異なる．課題も異なる．したがって，同一個人内の関係は検証できない．</w:t>
+      </w:r>
+    </w:p>
+    <w:p>
+      <w:pPr>
         <w:widowControl/>
-        <w:spacing w:before="0" w:after="0" w:line="252" w:lineRule="auto"/>
         <w:ind w:firstLine="200"/>
       </w:pPr>
       <w:r>
-        <w:rPr>
-          <w:rFonts w:ascii="Times New Roman" w:hAnsi="Times New Roman" w:cs="Times New Roman" w:eastAsia="ＭＳ 明朝"/>
-          <w:sz w:val="20"/>
-        </w:rPr>
-        <w:t>さらに，DREAMERのDominanceについては原SAM画面の提示方向と教示文を最終確認する必要がある．本結果は探索的な二次分析であり，語彙VADによる誘発体験の個人内予測や，二つの尺度の測定不変性を証明するものではない．</w:t>
+        <w:t>第三に，</w:t>
+      </w:r>
+      <w:r>
+        <w:t>CASE</w:t>
+      </w:r>
+      <w:r>
+        <w:t>は</w:t>
+      </w:r>
+      <w:r>
+        <w:t>4</w:t>
+      </w:r>
+      <w:r>
+        <w:t>感情の</w:t>
+      </w:r>
+      <w:r>
+        <w:t>VA</w:t>
+      </w:r>
+      <w:r>
+        <w:t>のみである．十分な外的再現とはいえない．また，</w:t>
+      </w:r>
+      <w:r>
+        <w:t>DREAMER</w:t>
+      </w:r>
+      <w:r>
+        <w:t>の</w:t>
+      </w:r>
+      <w:r>
+        <w:t>Dominance</w:t>
+      </w:r>
+      <w:r>
+        <w:t>は，</w:t>
+      </w:r>
+      <w:r>
+        <w:t>SAM</w:t>
+      </w:r>
+      <w:r>
+        <w:t>画面の方向と教示文を最終確認する必要がある．以上から，本研究は探索的な二次データ分析と位置づける．</w:t>
       </w:r>
     </w:p>
     <w:p>
@@ -1072,65 +1672,81 @@
       </w:pPr>
       <w:r>
         <w:rPr>
-          <w:rFonts w:ascii="Times New Roman" w:hAnsi="Times New Roman" w:cs="Times New Roman" w:eastAsia="ＭＳ ゴシック"/>
+          <w:rFonts w:eastAsia="ＭＳ ゴシック"/>
           <w:b/>
-          <w:sz w:val="20"/>
-        </w:rPr>
-        <w:t>8 まとめと今後の課題</w:t>
-      </w:r>
-    </w:p>
-    <w:p>
-      <w:pPr>
-        <w:keepLines w:val="0"/>
+        </w:rPr>
+        <w:t xml:space="preserve">8 </w:t>
+      </w:r>
+      <w:r>
+        <w:rPr>
+          <w:rFonts w:eastAsia="ＭＳ ゴシック"/>
+          <w:b/>
+        </w:rPr>
+        <w:t>まとめと今後</w:t>
+      </w:r>
+    </w:p>
+    <w:p>
+      <w:pPr>
         <w:widowControl/>
-        <w:spacing w:before="0" w:after="0" w:line="252" w:lineRule="auto"/>
         <w:ind w:firstLine="200"/>
       </w:pPr>
       <w:r>
-        <w:rPr>
-          <w:rFonts w:ascii="Times New Roman" w:hAnsi="Times New Roman" w:cs="Times New Roman" w:eastAsia="ＭＳ 明朝"/>
-          <w:sz w:val="20"/>
-        </w:rPr>
-        <w:t>本研究は，構造相関，全体尺度写像，校正残差を順に評価する文脈横断的VAD監査法を提示した．Valenceは比較的転用しやすく，Arousalは校正を要し，Dominanceは直接転用できないという次元別の境界が得られた．今後は，DREAMERのDominance提示方向を最終確認し，別データベースで残差順位を再現する．さらに，同一参加者に対して語彙連想，感情概念の典型像，映像誘発体験を同一尺度で測定し，語彙と体験の差を個人内で直接検証する．</w:t>
-      </w:r>
-    </w:p>
-    <w:p>
-      <w:pPr>
-        <w:keepLines w:val="0"/>
+        <w:t>意味的評価と情動体験評価の対応は，</w:t>
+      </w:r>
+      <w:r>
+        <w:t>VAD</w:t>
+      </w:r>
+      <w:r>
+        <w:t>次元によって異なった．</w:t>
+      </w:r>
+      <w:r>
+        <w:t>Valence</w:t>
+      </w:r>
+      <w:r>
+        <w:t>では相対構造が保たれた．一方，値は中立点方向に縮んだ．</w:t>
+      </w:r>
+      <w:r>
+        <w:t>Arousal</w:t>
+      </w:r>
+      <w:r>
+        <w:t>では正の関連が得られたが，安定性に課題が残った．</w:t>
+      </w:r>
+      <w:r>
+        <w:t>Dominance</w:t>
+      </w:r>
+      <w:r>
+        <w:t>では明確な対応が得られなかった．</w:t>
+      </w:r>
+    </w:p>
+    <w:p>
+      <w:pPr>
         <w:widowControl/>
-        <w:spacing w:before="0" w:after="0" w:line="252" w:lineRule="auto"/>
         <w:ind w:firstLine="200"/>
       </w:pPr>
       <w:r>
-        <w:rPr>
-          <w:rFonts w:ascii="Times New Roman" w:hAnsi="Times New Roman" w:cs="Times New Roman" w:eastAsia="ＭＳ 明朝"/>
-          <w:sz w:val="20"/>
-        </w:rPr>
-        <w:t>次段階では，同一参加者が同一感情概念について，語義連想，典型的な感情像，映像視聴後の体験を同一SAM尺度で回答する被験者内実験を行う．概念原型と誘発体験の距離が語義連想との距離より小さいという仮説を事前登録し，36-45名を対象にEDA及びECG/PPGを同期収録して，課題差と個人差を分離する．</w:t>
+        <w:t>主分析の感情数と映像数は少ない．そのため，次に共通感情と映像数の多い外部データで再検証する．また，異なる参加者を比較したため，個人内の関係は分からない．そこで，同一参加者が意味的評価と情動体験評価を行う実験を計画する．</w:t>
       </w:r>
     </w:p>
     <w:p>
       <w:pPr>
         <w:keepNext/>
-        <w:spacing w:before="40" w:after="0" w:line="240" w:lineRule="auto"/>
-      </w:pPr>
-      <w:r>
-        <w:rPr>
-          <w:rFonts w:ascii="Times New Roman" w:hAnsi="Times New Roman" w:cs="Times New Roman" w:eastAsia="ＭＳ ゴシック"/>
+        <w:spacing w:before="40" w:line="240" w:lineRule="auto"/>
+      </w:pPr>
+      <w:r>
+        <w:rPr>
+          <w:rFonts w:eastAsia="ＭＳ ゴシック"/>
           <w:b/>
-          <w:sz w:val="20"/>
         </w:rPr>
         <w:t>参考文献</w:t>
       </w:r>
     </w:p>
     <w:p>
       <w:pPr>
-        <w:spacing w:before="0" w:after="0" w:line="240" w:lineRule="auto"/>
+        <w:spacing w:line="240" w:lineRule="auto"/>
         <w:ind w:left="200" w:hanging="200"/>
       </w:pPr>
       <w:r>
         <w:rPr>
-          <w:rFonts w:ascii="Times New Roman" w:hAnsi="Times New Roman" w:cs="Times New Roman" w:eastAsia="ＭＳ 明朝"/>
           <w:sz w:val="18"/>
         </w:rPr>
         <w:t>[1] Bradley, M. M., Lang, P. J. J. Behav. Ther. Exp. Psychiatry. 1994, Vol.25, No.1, p.49-59.</w:t>
@@ -1138,12 +1754,11 @@
     </w:p>
     <w:p>
       <w:pPr>
-        <w:spacing w:before="0" w:after="0" w:line="240" w:lineRule="auto"/>
+        <w:spacing w:line="240" w:lineRule="auto"/>
         <w:ind w:left="200" w:hanging="200"/>
       </w:pPr>
       <w:r>
         <w:rPr>
-          <w:rFonts w:ascii="Times New Roman" w:hAnsi="Times New Roman" w:cs="Times New Roman" w:eastAsia="ＭＳ 明朝"/>
           <w:sz w:val="18"/>
         </w:rPr>
         <w:t>[2] Katsigiannis, S., Ramzan, N. IEEE J. Biomed. Health Inform. 2018, Vol.22, No.1, p.98-107.</w:t>
@@ -1151,12 +1766,11 @@
     </w:p>
     <w:p>
       <w:pPr>
-        <w:spacing w:before="0" w:after="0" w:line="240" w:lineRule="auto"/>
+        <w:spacing w:line="240" w:lineRule="auto"/>
         <w:ind w:left="200" w:hanging="200"/>
       </w:pPr>
       <w:r>
         <w:rPr>
-          <w:rFonts w:ascii="Times New Roman" w:hAnsi="Times New Roman" w:cs="Times New Roman" w:eastAsia="ＭＳ 明朝"/>
           <w:sz w:val="18"/>
         </w:rPr>
         <w:t>[3] Mohammad, S. M. NRC VAD Lexicon v2. arXiv:2503.23547, 2025.</w:t>
@@ -1164,35 +1778,45 @@
     </w:p>
     <w:p>
       <w:pPr>
-        <w:spacing w:before="0" w:after="0" w:line="240" w:lineRule="auto"/>
+        <w:spacing w:line="240" w:lineRule="auto"/>
         <w:ind w:left="200" w:hanging="200"/>
       </w:pPr>
       <w:r>
         <w:rPr>
-          <w:rFonts w:ascii="Times New Roman" w:hAnsi="Times New Roman" w:cs="Times New Roman" w:eastAsia="ＭＳ 明朝"/>
           <w:sz w:val="18"/>
         </w:rPr>
-        <w:t>[4] Barrett, L. F. J. Pers. Soc. Psychol. 2004, Vol.87, No.2, p.266-281.</w:t>
-      </w:r>
-    </w:p>
-    <w:p>
-      <w:pPr>
-        <w:spacing w:before="0" w:after="0" w:line="240" w:lineRule="auto"/>
+        <w:t>[4] Sharma, K., et al. Sci. Data. 2019, Vol.6, 196.</w:t>
+      </w:r>
+    </w:p>
+    <w:p>
+      <w:pPr>
+        <w:spacing w:line="240" w:lineRule="auto"/>
         <w:ind w:left="200" w:hanging="200"/>
       </w:pPr>
       <w:r>
         <w:rPr>
-          <w:rFonts w:ascii="Times New Roman" w:hAnsi="Times New Roman" w:cs="Times New Roman" w:eastAsia="ＭＳ 明朝"/>
           <w:sz w:val="18"/>
         </w:rPr>
-        <w:t>[5] Robinson, M. D., Clore, G. L. Psychol. Bull. 2002, Vol.128, No.6, p.934-960.</w:t>
+        <w:t>[5] Barrett, L. F. J. Pers. Soc. Psychol. 2004, Vol.87, No.2, p.266-281.</w:t>
+      </w:r>
+    </w:p>
+    <w:p>
+      <w:pPr>
+        <w:spacing w:line="240" w:lineRule="auto"/>
+        <w:ind w:left="200" w:hanging="200"/>
+      </w:pPr>
+      <w:r>
+        <w:rPr>
+          <w:sz w:val="18"/>
+        </w:rPr>
+        <w:t>[6] Robinson, M. D., Clore, G. L. Psychol. Bull. 2002, Vol.128, No.6, p.934-960.</w:t>
       </w:r>
     </w:p>
     <w:sectPr>
       <w:type w:val="continuous"/>
       <w:pgSz w:w="11906" w:h="16838"/>
       <w:pgMar w:top="1138" w:right="1310" w:bottom="1138" w:left="1310" w:header="283" w:footer="283" w:gutter="0"/>
-      <w:cols w:num="2" w:space="360" w:equalWidth="1"/>
+      <w:cols w:num="2" w:space="360"/>
     </w:sectPr>
   </w:body>
 </w:document>
@@ -1202,9 +1826,6 @@
 <w:endnotes xmlns:wpc="http://schemas.microsoft.com/office/word/2010/wordprocessingCanvas" xmlns:cx="http://schemas.microsoft.com/office/drawing/2014/chartex" xmlns:cx1="http://schemas.microsoft.com/office/drawing/2015/9/8/chartex" xmlns:cx2="http://schemas.microsoft.com/office/drawing/2015/10/21/chartex" xmlns:cx3="http://schemas.microsoft.com/office/drawing/2016/5/9/chartex" xmlns:cx4="http://schemas.microsoft.com/office/drawing/2016/5/10/chartex" xmlns:cx5="http://schemas.microsoft.com/office/drawing/2016/5/11/chartex" xmlns:cx6="http://schemas.microsoft.com/office/drawing/2016/5/12/chartex" xmlns:cx7="http://schemas.microsoft.com/office/drawing/2016/5/13/chartex" xmlns:cx8="http://schemas.microsoft.com/office/drawing/2016/5/14/chartex" xmlns:mc="http://schemas.openxmlformats.org/markup-compatibility/2006" xmlns:aink="http://schemas.microsoft.com/office/drawing/2016/ink" xmlns:am3d="http://schemas.microsoft.com/office/drawing/2017/model3d" xmlns:o="urn:schemas-microsoft-com:office:office" xmlns:oel="http://schemas.microsoft.com/office/2019/extlst" xmlns:r="http://schemas.openxmlformats.org/officeDocument/2006/relationships" xmlns:m="http://schemas.openxmlformats.org/officeDocument/2006/math" xmlns:v="urn:schemas-microsoft-com:vml" xmlns:wp14="http://schemas.microsoft.com/office/word/2010/wordprocessingDrawing" xmlns:wp="http://schemas.openxmlformats.org/drawingml/2006/wordprocessingDrawing" xmlns:w10="urn:schemas-microsoft-com:office:word" xmlns:w="http://schemas.openxmlformats.org/wordprocessingml/2006/main" xmlns:w14="http://schemas.microsoft.com/office/word/2010/wordml" xmlns:w15="http://schemas.microsoft.com/office/word/2012/wordml" xmlns:w16cex="http://schemas.microsoft.com/office/word/2018/wordml/cex" xmlns:w16cid="http://schemas.microsoft.com/office/word/2016/wordml/cid" xmlns:w16="http://schemas.microsoft.com/office/word/2018/wordml" xmlns:w16du="http://schemas.microsoft.com/office/word/2023/wordml/word16du" xmlns:w16sdtdh="http://schemas.microsoft.com/office/word/2020/wordml/sdtdatahash" xmlns:w16sdtfl="http://schemas.microsoft.com/office/word/2024/wordml/sdtformatlock" xmlns:w16se="http://schemas.microsoft.com/office/word/2015/wordml/symex" xmlns:wpg="http://schemas.microsoft.com/office/word/2010/wordprocessingGroup" xmlns:wpi="http://schemas.microsoft.com/office/word/2010/wordprocessingInk" xmlns:wne="http://schemas.microsoft.com/office/word/2006/wordml" xmlns:wps="http://schemas.microsoft.com/office/word/2010/wordprocessingShape" mc:Ignorable="w14 w15 w16se w16cid w16 w16cex w16sdtdh w16sdtfl w16du wp14">
   <w:endnote w:type="separator" w:id="-1">
     <w:p>
-      <w:pPr>
-        <w:spacing w:after="0"/>
-      </w:pPr>
       <w:r>
         <w:separator/>
       </w:r>
@@ -1212,9 +1833,6 @@
   </w:endnote>
   <w:endnote w:type="continuationSeparator" w:id="0">
     <w:p>
-      <w:pPr>
-        <w:spacing w:after="0"/>
-      </w:pPr>
       <w:r>
         <w:continuationSeparator/>
       </w:r>
@@ -1227,86 +1845,36 @@
 <w:ftr xmlns:wpc="http://schemas.microsoft.com/office/word/2010/wordprocessingCanvas" xmlns:cx="http://schemas.microsoft.com/office/drawing/2014/chartex" xmlns:cx1="http://schemas.microsoft.com/office/drawing/2015/9/8/chartex" xmlns:cx2="http://schemas.microsoft.com/office/drawing/2015/10/21/chartex" xmlns:cx3="http://schemas.microsoft.com/office/drawing/2016/5/9/chartex" xmlns:cx4="http://schemas.microsoft.com/office/drawing/2016/5/10/chartex" xmlns:cx5="http://schemas.microsoft.com/office/drawing/2016/5/11/chartex" xmlns:cx6="http://schemas.microsoft.com/office/drawing/2016/5/12/chartex" xmlns:cx7="http://schemas.microsoft.com/office/drawing/2016/5/13/chartex" xmlns:cx8="http://schemas.microsoft.com/office/drawing/2016/5/14/chartex" xmlns:mc="http://schemas.openxmlformats.org/markup-compatibility/2006" xmlns:aink="http://schemas.microsoft.com/office/drawing/2016/ink" xmlns:am3d="http://schemas.microsoft.com/office/drawing/2017/model3d" xmlns:o="urn:schemas-microsoft-com:office:office" xmlns:oel="http://schemas.microsoft.com/office/2019/extlst" xmlns:r="http://schemas.openxmlformats.org/officeDocument/2006/relationships" xmlns:m="http://schemas.openxmlformats.org/officeDocument/2006/math" xmlns:v="urn:schemas-microsoft-com:vml" xmlns:wp14="http://schemas.microsoft.com/office/word/2010/wordprocessingDrawing" xmlns:wp="http://schemas.openxmlformats.org/drawingml/2006/wordprocessingDrawing" xmlns:w10="urn:schemas-microsoft-com:office:word" xmlns:w="http://schemas.openxmlformats.org/wordprocessingml/2006/main" xmlns:w14="http://schemas.microsoft.com/office/word/2010/wordml" xmlns:w15="http://schemas.microsoft.com/office/word/2012/wordml" xmlns:w16cex="http://schemas.microsoft.com/office/word/2018/wordml/cex" xmlns:w16cid="http://schemas.microsoft.com/office/word/2016/wordml/cid" xmlns:w16="http://schemas.microsoft.com/office/word/2018/wordml" xmlns:w16du="http://schemas.microsoft.com/office/word/2023/wordml/word16du" xmlns:w16sdtdh="http://schemas.microsoft.com/office/word/2020/wordml/sdtdatahash" xmlns:w16sdtfl="http://schemas.microsoft.com/office/word/2024/wordml/sdtformatlock" xmlns:w16se="http://schemas.microsoft.com/office/word/2015/wordml/symex" xmlns:wpg="http://schemas.microsoft.com/office/word/2010/wordprocessingGroup" xmlns:wpi="http://schemas.microsoft.com/office/word/2010/wordprocessingInk" xmlns:wne="http://schemas.microsoft.com/office/word/2006/wordml" xmlns:wps="http://schemas.microsoft.com/office/word/2010/wordprocessingShape" mc:Ignorable="w14 w15 w16se w16cid w16 w16cex w16sdtdh w16sdtfl w16du wp14">
   <w:p>
     <w:pPr>
-      <w:pBdr>
-        <w:top w:val="nil"/>
-        <w:left w:val="nil"/>
-        <w:bottom w:val="nil"/>
-        <w:right w:val="nil"/>
-        <w:between w:val="nil"/>
-      </w:pBdr>
-      <w:tabs>
-        <w:tab w:val="center" w:pos="4252"/>
-        <w:tab w:val="right" w:pos="8504"/>
-      </w:tabs>
-      <w:rPr>
-        <w:color w:val="000000"/>
-      </w:rPr>
-    </w:pPr>
-  </w:p>
-</w:ftr>
-</file>
-
-<file path=word/footer2.xml><?xml version="1.0" encoding="utf-8"?>
-<w:ftr xmlns:wpc="http://schemas.microsoft.com/office/word/2010/wordprocessingCanvas" xmlns:cx="http://schemas.microsoft.com/office/drawing/2014/chartex" xmlns:cx1="http://schemas.microsoft.com/office/drawing/2015/9/8/chartex" xmlns:cx2="http://schemas.microsoft.com/office/drawing/2015/10/21/chartex" xmlns:cx3="http://schemas.microsoft.com/office/drawing/2016/5/9/chartex" xmlns:cx4="http://schemas.microsoft.com/office/drawing/2016/5/10/chartex" xmlns:cx5="http://schemas.microsoft.com/office/drawing/2016/5/11/chartex" xmlns:cx6="http://schemas.microsoft.com/office/drawing/2016/5/12/chartex" xmlns:cx7="http://schemas.microsoft.com/office/drawing/2016/5/13/chartex" xmlns:cx8="http://schemas.microsoft.com/office/drawing/2016/5/14/chartex" xmlns:mc="http://schemas.openxmlformats.org/markup-compatibility/2006" xmlns:aink="http://schemas.microsoft.com/office/drawing/2016/ink" xmlns:am3d="http://schemas.microsoft.com/office/drawing/2017/model3d" xmlns:o="urn:schemas-microsoft-com:office:office" xmlns:oel="http://schemas.microsoft.com/office/2019/extlst" xmlns:r="http://schemas.openxmlformats.org/officeDocument/2006/relationships" xmlns:m="http://schemas.openxmlformats.org/officeDocument/2006/math" xmlns:v="urn:schemas-microsoft-com:vml" xmlns:wp14="http://schemas.microsoft.com/office/word/2010/wordprocessingDrawing" xmlns:wp="http://schemas.openxmlformats.org/drawingml/2006/wordprocessingDrawing" xmlns:w10="urn:schemas-microsoft-com:office:word" xmlns:w="http://schemas.openxmlformats.org/wordprocessingml/2006/main" xmlns:w14="http://schemas.microsoft.com/office/word/2010/wordml" xmlns:w15="http://schemas.microsoft.com/office/word/2012/wordml" xmlns:w16cex="http://schemas.microsoft.com/office/word/2018/wordml/cex" xmlns:w16cid="http://schemas.microsoft.com/office/word/2016/wordml/cid" xmlns:w16="http://schemas.microsoft.com/office/word/2018/wordml" xmlns:w16du="http://schemas.microsoft.com/office/word/2023/wordml/word16du" xmlns:w16sdtdh="http://schemas.microsoft.com/office/word/2020/wordml/sdtdatahash" xmlns:w16sdtfl="http://schemas.microsoft.com/office/word/2024/wordml/sdtformatlock" xmlns:w16se="http://schemas.microsoft.com/office/word/2015/wordml/symex" xmlns:wpg="http://schemas.microsoft.com/office/word/2010/wordprocessingGroup" xmlns:wpi="http://schemas.microsoft.com/office/word/2010/wordprocessingInk" xmlns:wne="http://schemas.microsoft.com/office/word/2006/wordml" xmlns:wps="http://schemas.microsoft.com/office/word/2010/wordprocessingShape" mc:Ignorable="w14 w15 w16se w16cid w16 w16cex w16sdtdh w16sdtfl w16du wp14">
-  <w:p>
-    <w:pPr>
-      <w:pBdr>
-        <w:top w:val="nil"/>
-        <w:left w:val="nil"/>
-        <w:bottom w:val="nil"/>
-        <w:right w:val="nil"/>
-        <w:between w:val="nil"/>
-      </w:pBdr>
-      <w:tabs>
-        <w:tab w:val="center" w:pos="4252"/>
-        <w:tab w:val="right" w:pos="8504"/>
-      </w:tabs>
-      <w:rPr>
-        <w:color w:val="000000"/>
-      </w:rPr>
-    </w:pPr>
-  </w:p>
-</w:ftr>
-</file>
-
-<file path=word/footer3.xml><?xml version="1.0" encoding="utf-8"?>
-<w:ftr xmlns:wpc="http://schemas.microsoft.com/office/word/2010/wordprocessingCanvas" xmlns:cx="http://schemas.microsoft.com/office/drawing/2014/chartex" xmlns:cx1="http://schemas.microsoft.com/office/drawing/2015/9/8/chartex" xmlns:cx2="http://schemas.microsoft.com/office/drawing/2015/10/21/chartex" xmlns:cx3="http://schemas.microsoft.com/office/drawing/2016/5/9/chartex" xmlns:cx4="http://schemas.microsoft.com/office/drawing/2016/5/10/chartex" xmlns:cx5="http://schemas.microsoft.com/office/drawing/2016/5/11/chartex" xmlns:cx6="http://schemas.microsoft.com/office/drawing/2016/5/12/chartex" xmlns:cx7="http://schemas.microsoft.com/office/drawing/2016/5/13/chartex" xmlns:cx8="http://schemas.microsoft.com/office/drawing/2016/5/14/chartex" xmlns:mc="http://schemas.openxmlformats.org/markup-compatibility/2006" xmlns:aink="http://schemas.microsoft.com/office/drawing/2016/ink" xmlns:am3d="http://schemas.microsoft.com/office/drawing/2017/model3d" xmlns:o="urn:schemas-microsoft-com:office:office" xmlns:oel="http://schemas.microsoft.com/office/2019/extlst" xmlns:r="http://schemas.openxmlformats.org/officeDocument/2006/relationships" xmlns:m="http://schemas.openxmlformats.org/officeDocument/2006/math" xmlns:v="urn:schemas-microsoft-com:vml" xmlns:wp14="http://schemas.microsoft.com/office/word/2010/wordprocessingDrawing" xmlns:wp="http://schemas.openxmlformats.org/drawingml/2006/wordprocessingDrawing" xmlns:w10="urn:schemas-microsoft-com:office:word" xmlns:w="http://schemas.openxmlformats.org/wordprocessingml/2006/main" xmlns:w14="http://schemas.microsoft.com/office/word/2010/wordml" xmlns:w15="http://schemas.microsoft.com/office/word/2012/wordml" xmlns:w16cex="http://schemas.microsoft.com/office/word/2018/wordml/cex" xmlns:w16cid="http://schemas.microsoft.com/office/word/2016/wordml/cid" xmlns:w16="http://schemas.microsoft.com/office/word/2018/wordml" xmlns:w16du="http://schemas.microsoft.com/office/word/2023/wordml/word16du" xmlns:w16sdtdh="http://schemas.microsoft.com/office/word/2020/wordml/sdtdatahash" xmlns:w16sdtfl="http://schemas.microsoft.com/office/word/2024/wordml/sdtformatlock" xmlns:w16se="http://schemas.microsoft.com/office/word/2015/wordml/symex" xmlns:wpg="http://schemas.microsoft.com/office/word/2010/wordprocessingGroup" xmlns:wpi="http://schemas.microsoft.com/office/word/2010/wordprocessingInk" xmlns:wne="http://schemas.microsoft.com/office/word/2006/wordml" xmlns:wps="http://schemas.microsoft.com/office/word/2010/wordprocessingShape" mc:Ignorable="w14 w15 w16se w16cid w16 w16cex w16sdtdh w16sdtfl w16du wp14">
-  <w:p>
-    <w:pPr>
-      <w:pBdr>
-        <w:top w:val="nil"/>
-        <w:left w:val="nil"/>
-        <w:bottom w:val="nil"/>
-        <w:right w:val="nil"/>
-        <w:between w:val="nil"/>
-      </w:pBdr>
-      <w:tabs>
-        <w:tab w:val="center" w:pos="4252"/>
-        <w:tab w:val="right" w:pos="8504"/>
-      </w:tabs>
-      <w:rPr>
-        <w:color w:val="000000"/>
-      </w:rPr>
-    </w:pPr>
-  </w:p>
-</w:ftr>
-</file>
-
-<file path=word/footer4.xml><?xml version="1.0" encoding="utf-8"?>
-<w:ftr xmlns:m="http://schemas.openxmlformats.org/officeDocument/2006/math" xmlns:mc="http://schemas.openxmlformats.org/markup-compatibility/2006" xmlns:mo="http://schemas.microsoft.com/office/mac/office/2008/main" xmlns:mv="urn:schemas-microsoft-com:mac:vml" xmlns:o="urn:schemas-microsoft-com:office:office" xmlns:r="http://schemas.openxmlformats.org/officeDocument/2006/relationships" xmlns:v="urn:schemas-microsoft-com:vml" xmlns:w10="urn:schemas-microsoft-com:office:word" xmlns:w14="http://schemas.microsoft.com/office/word/2010/wordml" xmlns:w="http://schemas.openxmlformats.org/wordprocessingml/2006/main" xmlns:wne="http://schemas.microsoft.com/office/word/2006/wordml" xmlns:wp14="http://schemas.microsoft.com/office/word/2010/wordprocessingDrawing" xmlns:wp="http://schemas.openxmlformats.org/drawingml/2006/wordprocessingDrawing" xmlns:wpc="http://schemas.microsoft.com/office/word/2010/wordprocessingCanvas" xmlns:wpg="http://schemas.microsoft.com/office/word/2010/wordprocessingGroup" xmlns:wpi="http://schemas.microsoft.com/office/word/2010/wordprocessingInk" xmlns:wps="http://schemas.microsoft.com/office/word/2010/wordprocessingShape" mc:Ignorable="w14 wp14">
-  <w:p>
-    <w:pPr>
       <w:jc w:val="center"/>
     </w:pPr>
     <w:r>
       <w:rPr>
-        <w:rFonts w:ascii="Times New Roman" w:hAnsi="Times New Roman" w:cs="Times New Roman" w:eastAsia="ＭＳ 明朝"/>
         <w:sz w:val="18"/>
       </w:rPr>
       <w:fldChar w:fldCharType="begin"/>
+    </w:r>
+    <w:r>
+      <w:rPr>
+        <w:sz w:val="18"/>
+      </w:rPr>
       <w:instrText xml:space="preserve"> PAGE </w:instrText>
+    </w:r>
+    <w:r>
+      <w:rPr>
+        <w:sz w:val="18"/>
+      </w:rPr>
       <w:fldChar w:fldCharType="separate"/>
+    </w:r>
+    <w:r>
+      <w:rPr>
+        <w:sz w:val="18"/>
+      </w:rPr>
       <w:t>1</w:t>
+    </w:r>
+    <w:r>
+      <w:rPr>
+        <w:sz w:val="18"/>
+      </w:rPr>
       <w:fldChar w:fldCharType="end"/>
     </w:r>
   </w:p>
@@ -1317,9 +1885,6 @@
 <w:footnotes xmlns:wpc="http://schemas.microsoft.com/office/word/2010/wordprocessingCanvas" xmlns:cx="http://schemas.microsoft.com/office/drawing/2014/chartex" xmlns:cx1="http://schemas.microsoft.com/office/drawing/2015/9/8/chartex" xmlns:cx2="http://schemas.microsoft.com/office/drawing/2015/10/21/chartex" xmlns:cx3="http://schemas.microsoft.com/office/drawing/2016/5/9/chartex" xmlns:cx4="http://schemas.microsoft.com/office/drawing/2016/5/10/chartex" xmlns:cx5="http://schemas.microsoft.com/office/drawing/2016/5/11/chartex" xmlns:cx6="http://schemas.microsoft.com/office/drawing/2016/5/12/chartex" xmlns:cx7="http://schemas.microsoft.com/office/drawing/2016/5/13/chartex" xmlns:cx8="http://schemas.microsoft.com/office/drawing/2016/5/14/chartex" xmlns:mc="http://schemas.openxmlformats.org/markup-compatibility/2006" xmlns:aink="http://schemas.microsoft.com/office/drawing/2016/ink" xmlns:am3d="http://schemas.microsoft.com/office/drawing/2017/model3d" xmlns:o="urn:schemas-microsoft-com:office:office" xmlns:oel="http://schemas.microsoft.com/office/2019/extlst" xmlns:r="http://schemas.openxmlformats.org/officeDocument/2006/relationships" xmlns:m="http://schemas.openxmlformats.org/officeDocument/2006/math" xmlns:v="urn:schemas-microsoft-com:vml" xmlns:wp14="http://schemas.microsoft.com/office/word/2010/wordprocessingDrawing" xmlns:wp="http://schemas.openxmlformats.org/drawingml/2006/wordprocessingDrawing" xmlns:w10="urn:schemas-microsoft-com:office:word" xmlns:w="http://schemas.openxmlformats.org/wordprocessingml/2006/main" xmlns:w14="http://schemas.microsoft.com/office/word/2010/wordml" xmlns:w15="http://schemas.microsoft.com/office/word/2012/wordml" xmlns:w16cex="http://schemas.microsoft.com/office/word/2018/wordml/cex" xmlns:w16cid="http://schemas.microsoft.com/office/word/2016/wordml/cid" xmlns:w16="http://schemas.microsoft.com/office/word/2018/wordml" xmlns:w16du="http://schemas.microsoft.com/office/word/2023/wordml/word16du" xmlns:w16sdtdh="http://schemas.microsoft.com/office/word/2020/wordml/sdtdatahash" xmlns:w16sdtfl="http://schemas.microsoft.com/office/word/2024/wordml/sdtformatlock" xmlns:w16se="http://schemas.microsoft.com/office/word/2015/wordml/symex" xmlns:wpg="http://schemas.microsoft.com/office/word/2010/wordprocessingGroup" xmlns:wpi="http://schemas.microsoft.com/office/word/2010/wordprocessingInk" xmlns:wne="http://schemas.microsoft.com/office/word/2006/wordml" xmlns:wps="http://schemas.microsoft.com/office/word/2010/wordprocessingShape" mc:Ignorable="w14 w15 w16se w16cid w16 w16cex w16sdtdh w16sdtfl w16du wp14">
   <w:footnote w:type="separator" w:id="-1">
     <w:p>
-      <w:pPr>
-        <w:spacing w:after="0"/>
-      </w:pPr>
       <w:r>
         <w:separator/>
       </w:r>
@@ -1327,84 +1892,12 @@
   </w:footnote>
   <w:footnote w:type="continuationSeparator" w:id="0">
     <w:p>
-      <w:pPr>
-        <w:spacing w:after="0"/>
-      </w:pPr>
       <w:r>
         <w:continuationSeparator/>
       </w:r>
     </w:p>
   </w:footnote>
 </w:footnotes>
-</file>
-
-<file path=word/header1.xml><?xml version="1.0" encoding="utf-8"?>
-<w:hdr xmlns:wpc="http://schemas.microsoft.com/office/word/2010/wordprocessingCanvas" xmlns:cx="http://schemas.microsoft.com/office/drawing/2014/chartex" xmlns:cx1="http://schemas.microsoft.com/office/drawing/2015/9/8/chartex" xmlns:cx2="http://schemas.microsoft.com/office/drawing/2015/10/21/chartex" xmlns:cx3="http://schemas.microsoft.com/office/drawing/2016/5/9/chartex" xmlns:cx4="http://schemas.microsoft.com/office/drawing/2016/5/10/chartex" xmlns:cx5="http://schemas.microsoft.com/office/drawing/2016/5/11/chartex" xmlns:cx6="http://schemas.microsoft.com/office/drawing/2016/5/12/chartex" xmlns:cx7="http://schemas.microsoft.com/office/drawing/2016/5/13/chartex" xmlns:cx8="http://schemas.microsoft.com/office/drawing/2016/5/14/chartex" xmlns:mc="http://schemas.openxmlformats.org/markup-compatibility/2006" xmlns:aink="http://schemas.microsoft.com/office/drawing/2016/ink" xmlns:am3d="http://schemas.microsoft.com/office/drawing/2017/model3d" xmlns:o="urn:schemas-microsoft-com:office:office" xmlns:oel="http://schemas.microsoft.com/office/2019/extlst" xmlns:r="http://schemas.openxmlformats.org/officeDocument/2006/relationships" xmlns:m="http://schemas.openxmlformats.org/officeDocument/2006/math" xmlns:v="urn:schemas-microsoft-com:vml" xmlns:wp14="http://schemas.microsoft.com/office/word/2010/wordprocessingDrawing" xmlns:wp="http://schemas.openxmlformats.org/drawingml/2006/wordprocessingDrawing" xmlns:w10="urn:schemas-microsoft-com:office:word" xmlns:w="http://schemas.openxmlformats.org/wordprocessingml/2006/main" xmlns:w14="http://schemas.microsoft.com/office/word/2010/wordml" xmlns:w15="http://schemas.microsoft.com/office/word/2012/wordml" xmlns:w16cex="http://schemas.microsoft.com/office/word/2018/wordml/cex" xmlns:w16cid="http://schemas.microsoft.com/office/word/2016/wordml/cid" xmlns:w16="http://schemas.microsoft.com/office/word/2018/wordml" xmlns:w16du="http://schemas.microsoft.com/office/word/2023/wordml/word16du" xmlns:w16sdtdh="http://schemas.microsoft.com/office/word/2020/wordml/sdtdatahash" xmlns:w16sdtfl="http://schemas.microsoft.com/office/word/2024/wordml/sdtformatlock" xmlns:w16se="http://schemas.microsoft.com/office/word/2015/wordml/symex" xmlns:wpg="http://schemas.microsoft.com/office/word/2010/wordprocessingGroup" xmlns:wpi="http://schemas.microsoft.com/office/word/2010/wordprocessingInk" xmlns:wne="http://schemas.microsoft.com/office/word/2006/wordml" xmlns:wps="http://schemas.microsoft.com/office/word/2010/wordprocessingShape" mc:Ignorable="w14 w15 w16se w16cid w16 w16cex w16sdtdh w16sdtfl w16du wp14">
-  <w:p>
-    <w:pPr>
-      <w:pBdr>
-        <w:top w:val="nil"/>
-        <w:left w:val="nil"/>
-        <w:bottom w:val="nil"/>
-        <w:right w:val="nil"/>
-        <w:between w:val="nil"/>
-      </w:pBdr>
-      <w:tabs>
-        <w:tab w:val="center" w:pos="4252"/>
-        <w:tab w:val="right" w:pos="8504"/>
-      </w:tabs>
-      <w:rPr>
-        <w:color w:val="000000"/>
-      </w:rPr>
-    </w:pPr>
-  </w:p>
-</w:hdr>
-</file>
-
-<file path=word/header2.xml><?xml version="1.0" encoding="utf-8"?>
-<w:hdr xmlns:wpc="http://schemas.microsoft.com/office/word/2010/wordprocessingCanvas" xmlns:cx="http://schemas.microsoft.com/office/drawing/2014/chartex" xmlns:cx1="http://schemas.microsoft.com/office/drawing/2015/9/8/chartex" xmlns:cx2="http://schemas.microsoft.com/office/drawing/2015/10/21/chartex" xmlns:cx3="http://schemas.microsoft.com/office/drawing/2016/5/9/chartex" xmlns:cx4="http://schemas.microsoft.com/office/drawing/2016/5/10/chartex" xmlns:cx5="http://schemas.microsoft.com/office/drawing/2016/5/11/chartex" xmlns:cx6="http://schemas.microsoft.com/office/drawing/2016/5/12/chartex" xmlns:cx7="http://schemas.microsoft.com/office/drawing/2016/5/13/chartex" xmlns:cx8="http://schemas.microsoft.com/office/drawing/2016/5/14/chartex" xmlns:mc="http://schemas.openxmlformats.org/markup-compatibility/2006" xmlns:aink="http://schemas.microsoft.com/office/drawing/2016/ink" xmlns:am3d="http://schemas.microsoft.com/office/drawing/2017/model3d" xmlns:o="urn:schemas-microsoft-com:office:office" xmlns:oel="http://schemas.microsoft.com/office/2019/extlst" xmlns:r="http://schemas.openxmlformats.org/officeDocument/2006/relationships" xmlns:m="http://schemas.openxmlformats.org/officeDocument/2006/math" xmlns:v="urn:schemas-microsoft-com:vml" xmlns:wp14="http://schemas.microsoft.com/office/word/2010/wordprocessingDrawing" xmlns:wp="http://schemas.openxmlformats.org/drawingml/2006/wordprocessingDrawing" xmlns:w10="urn:schemas-microsoft-com:office:word" xmlns:w="http://schemas.openxmlformats.org/wordprocessingml/2006/main" xmlns:w14="http://schemas.microsoft.com/office/word/2010/wordml" xmlns:w15="http://schemas.microsoft.com/office/word/2012/wordml" xmlns:w16cex="http://schemas.microsoft.com/office/word/2018/wordml/cex" xmlns:w16cid="http://schemas.microsoft.com/office/word/2016/wordml/cid" xmlns:w16="http://schemas.microsoft.com/office/word/2018/wordml" xmlns:w16du="http://schemas.microsoft.com/office/word/2023/wordml/word16du" xmlns:w16sdtdh="http://schemas.microsoft.com/office/word/2020/wordml/sdtdatahash" xmlns:w16sdtfl="http://schemas.microsoft.com/office/word/2024/wordml/sdtformatlock" xmlns:w16se="http://schemas.microsoft.com/office/word/2015/wordml/symex" xmlns:wpg="http://schemas.microsoft.com/office/word/2010/wordprocessingGroup" xmlns:wpi="http://schemas.microsoft.com/office/word/2010/wordprocessingInk" xmlns:wne="http://schemas.microsoft.com/office/word/2006/wordml" xmlns:wps="http://schemas.microsoft.com/office/word/2010/wordprocessingShape" mc:Ignorable="w14 w15 w16se w16cid w16 w16cex w16sdtdh w16sdtfl w16du wp14">
-  <w:p>
-    <w:pPr>
-      <w:pBdr>
-        <w:top w:val="nil"/>
-        <w:left w:val="nil"/>
-        <w:bottom w:val="nil"/>
-        <w:right w:val="nil"/>
-        <w:between w:val="nil"/>
-      </w:pBdr>
-      <w:tabs>
-        <w:tab w:val="center" w:pos="4252"/>
-        <w:tab w:val="right" w:pos="8504"/>
-      </w:tabs>
-      <w:rPr>
-        <w:color w:val="000000"/>
-      </w:rPr>
-    </w:pPr>
-  </w:p>
-</w:hdr>
-</file>
-
-<file path=word/header3.xml><?xml version="1.0" encoding="utf-8"?>
-<w:hdr xmlns:wpc="http://schemas.microsoft.com/office/word/2010/wordprocessingCanvas" xmlns:cx="http://schemas.microsoft.com/office/drawing/2014/chartex" xmlns:cx1="http://schemas.microsoft.com/office/drawing/2015/9/8/chartex" xmlns:cx2="http://schemas.microsoft.com/office/drawing/2015/10/21/chartex" xmlns:cx3="http://schemas.microsoft.com/office/drawing/2016/5/9/chartex" xmlns:cx4="http://schemas.microsoft.com/office/drawing/2016/5/10/chartex" xmlns:cx5="http://schemas.microsoft.com/office/drawing/2016/5/11/chartex" xmlns:cx6="http://schemas.microsoft.com/office/drawing/2016/5/12/chartex" xmlns:cx7="http://schemas.microsoft.com/office/drawing/2016/5/13/chartex" xmlns:cx8="http://schemas.microsoft.com/office/drawing/2016/5/14/chartex" xmlns:mc="http://schemas.openxmlformats.org/markup-compatibility/2006" xmlns:aink="http://schemas.microsoft.com/office/drawing/2016/ink" xmlns:am3d="http://schemas.microsoft.com/office/drawing/2017/model3d" xmlns:o="urn:schemas-microsoft-com:office:office" xmlns:oel="http://schemas.microsoft.com/office/2019/extlst" xmlns:r="http://schemas.openxmlformats.org/officeDocument/2006/relationships" xmlns:m="http://schemas.openxmlformats.org/officeDocument/2006/math" xmlns:v="urn:schemas-microsoft-com:vml" xmlns:wp14="http://schemas.microsoft.com/office/word/2010/wordprocessingDrawing" xmlns:wp="http://schemas.openxmlformats.org/drawingml/2006/wordprocessingDrawing" xmlns:w10="urn:schemas-microsoft-com:office:word" xmlns:w="http://schemas.openxmlformats.org/wordprocessingml/2006/main" xmlns:w14="http://schemas.microsoft.com/office/word/2010/wordml" xmlns:w15="http://schemas.microsoft.com/office/word/2012/wordml" xmlns:w16cex="http://schemas.microsoft.com/office/word/2018/wordml/cex" xmlns:w16cid="http://schemas.microsoft.com/office/word/2016/wordml/cid" xmlns:w16="http://schemas.microsoft.com/office/word/2018/wordml" xmlns:w16du="http://schemas.microsoft.com/office/word/2023/wordml/word16du" xmlns:w16sdtdh="http://schemas.microsoft.com/office/word/2020/wordml/sdtdatahash" xmlns:w16sdtfl="http://schemas.microsoft.com/office/word/2024/wordml/sdtformatlock" xmlns:w16se="http://schemas.microsoft.com/office/word/2015/wordml/symex" xmlns:wpg="http://schemas.microsoft.com/office/word/2010/wordprocessingGroup" xmlns:wpi="http://schemas.microsoft.com/office/word/2010/wordprocessingInk" xmlns:wne="http://schemas.microsoft.com/office/word/2006/wordml" xmlns:wps="http://schemas.microsoft.com/office/word/2010/wordprocessingShape" mc:Ignorable="w14 w15 w16se w16cid w16 w16cex w16sdtdh w16sdtfl w16du wp14">
-  <w:p>
-    <w:pPr>
-      <w:pBdr>
-        <w:top w:val="nil"/>
-        <w:left w:val="nil"/>
-        <w:bottom w:val="nil"/>
-        <w:right w:val="nil"/>
-        <w:between w:val="nil"/>
-      </w:pBdr>
-      <w:tabs>
-        <w:tab w:val="center" w:pos="4252"/>
-        <w:tab w:val="right" w:pos="8504"/>
-      </w:tabs>
-      <w:rPr>
-        <w:color w:val="000000"/>
-      </w:rPr>
-    </w:pPr>
-  </w:p>
-</w:hdr>
 </file>
 
 <file path=word/styles.xml><?xml version="1.0" encoding="utf-8"?>
@@ -1806,11 +2299,10 @@
     <w:name w:val="Normal"/>
     <w:qFormat/>
     <w:pPr>
-      <w:spacing w:before="0" w:after="0" w:line="252" w:lineRule="auto"/>
+      <w:spacing w:after="0" w:line="252" w:lineRule="auto"/>
     </w:pPr>
     <w:rPr>
-      <w:rFonts w:ascii="Times New Roman" w:hAnsi="Times New Roman" w:cs="Times New Roman" w:eastAsia="ＭＳ 明朝"/>
-      <w:sz w:val="20"/>
+      <w:rFonts w:ascii="Times New Roman" w:hAnsi="Times New Roman" w:cs="Times New Roman"/>
     </w:rPr>
   </w:style>
   <w:style w:type="paragraph" w:styleId="1">
@@ -1926,6 +2418,7 @@
   <w:style w:type="character" w:default="1" w:styleId="a0">
     <w:name w:val="Default Paragraph Font"/>
     <w:uiPriority w:val="1"/>
+    <w:semiHidden/>
     <w:unhideWhenUsed/>
   </w:style>
   <w:style w:type="table" w:default="1" w:styleId="a1">

</xml_diff>